<commit_message>
Rev C: remove speaker notes from public record document
Remove "Speaker Outline — Keyword Cues" and "Read-Aloud Script —
3 Minutes" from the consolidated filing. These were presentation
aids for the June 15 committee meeting and are not part of the
formal public record submission.
</commit_message>
<xml_diff>
--- a/Public_Record_Statement_Rev_C.docx
+++ b/Public_Record_Statement_Rev_C.docx
@@ -2,849 +2,6 @@
 <file path=word/document.xml><?xml version="1.0" encoding="utf-8"?>
 <w:document xmlns:wpc="http://schemas.microsoft.com/office/word/2010/wordprocessingCanvas" xmlns:mc="http://schemas.openxmlformats.org/markup-compatibility/2006" xmlns:o="urn:schemas-microsoft-com:office:office" xmlns:r="http://schemas.openxmlformats.org/officeDocument/2006/relationships" xmlns:m="http://schemas.openxmlformats.org/officeDocument/2006/math" xmlns:v="urn:schemas-microsoft-com:vml" xmlns:wp14="http://schemas.microsoft.com/office/word/2010/wordprocessingDrawing" xmlns:wp="http://schemas.openxmlformats.org/drawingml/2006/wordprocessingDrawing" xmlns:w10="urn:schemas-microsoft-com:office:word" xmlns:w="http://schemas.openxmlformats.org/wordprocessingml/2006/main" xmlns:w14="http://schemas.microsoft.com/office/word/2010/wordml" xmlns:w15="http://schemas.microsoft.com/office/word/2012/wordml" xmlns:wpg="http://schemas.microsoft.com/office/word/2010/wordprocessingGroup" xmlns:wpi="http://schemas.microsoft.com/office/word/2010/wordprocessingInk" xmlns:wne="http://schemas.microsoft.com/office/word/2006/wordml" xmlns:wps="http://schemas.microsoft.com/office/word/2010/wordprocessingShape" xmlns:cx="http://schemas.microsoft.com/office/drawing/2014/chartex" xmlns:cx1="http://schemas.microsoft.com/office/drawing/2015/9/8/chartex" xmlns:cx2="http://schemas.microsoft.com/office/drawing/2015/10/21/chartex" xmlns:cx3="http://schemas.microsoft.com/office/drawing/2016/5/9/chartex" xmlns:cx4="http://schemas.microsoft.com/office/drawing/2016/5/10/chartex" xmlns:cx5="http://schemas.microsoft.com/office/drawing/2016/5/11/chartex" xmlns:cx6="http://schemas.microsoft.com/office/drawing/2016/5/12/chartex" xmlns:cx7="http://schemas.microsoft.com/office/drawing/2016/5/13/chartex" xmlns:cx8="http://schemas.microsoft.com/office/drawing/2016/5/14/chartex" xmlns:aink="http://schemas.microsoft.com/office/drawing/2016/ink" xmlns:am3d="http://schemas.microsoft.com/office/drawing/2017/model3d" xmlns:w16cex="http://schemas.microsoft.com/office/word/2018/wordml/cex" xmlns:w16cid="http://schemas.microsoft.com/office/word/2016/wordml/cid" xmlns:w16="http://schemas.microsoft.com/office/word/2018/wordml" xmlns:w16sdtdh="http://schemas.microsoft.com/office/word/2020/wordml/sdtdatahash" xmlns:w16se="http://schemas.microsoft.com/office/word/2015/wordml/symex" mc:Ignorable="w14 w15 wp14">
   <w:body>
-    <w:p>
-      <w:pPr>
-        <w:spacing w:after="120"/>
-        <w:jc w:val="center"/>
-      </w:pPr>
-      <w:r>
-        <w:rPr>
-          <w:rFonts w:ascii="Arial" w:cs="Arial" w:eastAsia="Arial" w:hAnsi="Arial"/>
-          <w:b/>
-          <w:bCs/>
-          <w:sz w:val="36"/>
-          <w:szCs w:val="36"/>
-        </w:rPr>
-        <w:t xml:space="preserve">Speaker Outline — Keyword Cues</w:t>
-      </w:r>
-    </w:p>
-    <w:p>
-      <w:pPr>
-        <w:spacing w:after="480"/>
-        <w:jc w:val="center"/>
-      </w:pPr>
-      <w:r>
-        <w:rPr>
-          <w:rFonts w:ascii="Arial" w:cs="Arial" w:eastAsia="Arial" w:hAnsi="Arial"/>
-          <w:i/>
-          <w:iCs/>
-          <w:sz w:val="24"/>
-          <w:szCs w:val="24"/>
-        </w:rPr>
-        <w:t xml:space="preserve">Site Selection Committee Meeting  •  June 15, 2026  •  4:00 PM</w:t>
-      </w:r>
-    </w:p>
-    <w:p>
-      <w:pPr>
-        <w:spacing w:after="120" w:before="240"/>
-      </w:pPr>
-      <w:r>
-        <w:rPr>
-          <w:rFonts w:ascii="Arial" w:cs="Arial" w:eastAsia="Arial" w:hAnsi="Arial"/>
-          <w:b/>
-          <w:bCs/>
-          <w:color w:val="26215C"/>
-          <w:sz w:val="28"/>
-          <w:szCs w:val="28"/>
-        </w:rPr>
-        <w:t xml:space="preserve">OPENING</w:t>
-      </w:r>
-    </w:p>
-    <w:p>
-      <w:pPr>
-        <w:spacing w:after="100"/>
-        <w:ind w:left="360"/>
-      </w:pPr>
-      <w:r>
-        <w:rPr>
-          <w:rFonts w:ascii="Arial" w:cs="Arial" w:eastAsia="Arial" w:hAnsi="Arial"/>
-          <w:sz w:val="28"/>
-          <w:szCs w:val="28"/>
-        </w:rPr>
-        <w:t xml:space="preserve">•  Chairman Baines, committee members — Todd Roark + Tich Chaikumnerd + </w:t>
-      </w:r>
-      <w:r>
-        <w:rPr>
-          <w:rFonts w:ascii="Arial" w:cs="Arial" w:eastAsia="Arial" w:hAnsi="Arial"/>
-          <w:b/>
-          <w:bCs/>
-          <w:sz w:val="28"/>
-          <w:szCs w:val="28"/>
-        </w:rPr>
-        <w:t xml:space="preserve">nearly 200 endorsing residents</w:t>
-      </w:r>
-    </w:p>
-    <w:p>
-      <w:pPr>
-        <w:spacing w:after="100"/>
-        <w:ind w:left="360"/>
-      </w:pPr>
-      <w:r>
-        <w:rPr>
-          <w:rFonts w:ascii="Arial" w:cs="Arial" w:eastAsia="Arial" w:hAnsi="Arial"/>
-          <w:sz w:val="28"/>
-          <w:szCs w:val="28"/>
-        </w:rPr>
-        <w:t xml:space="preserve">•  Spoke May 27 + June 2 — today: </w:t>
-      </w:r>
-      <w:r>
-        <w:rPr>
-          <w:rFonts w:ascii="Arial" w:cs="Arial" w:eastAsia="Arial" w:hAnsi="Arial"/>
-          <w:b/>
-          <w:bCs/>
-          <w:sz w:val="28"/>
-          <w:szCs w:val="28"/>
-        </w:rPr>
-        <w:t xml:space="preserve">two new arguments + formal asks</w:t>
-      </w:r>
-    </w:p>
-    <w:p>
-      <w:pPr>
-        <w:spacing w:after="240"/>
-        <w:ind w:left="360"/>
-      </w:pPr>
-      <w:r>
-        <w:rPr>
-          <w:rFonts w:ascii="Arial" w:cs="Arial" w:eastAsia="Arial" w:hAnsi="Arial"/>
-          <w:sz w:val="28"/>
-          <w:szCs w:val="28"/>
-        </w:rPr>
-        <w:t xml:space="preserve">•  Sites 1–7 (of 19) still in the corridor;  Appendices B–H filed with the clerk</w:t>
-      </w:r>
-    </w:p>
-    <w:p>
-      <w:pPr>
-        <w:spacing w:after="120" w:before="240"/>
-      </w:pPr>
-      <w:r>
-        <w:rPr>
-          <w:rFonts w:ascii="Arial" w:cs="Arial" w:eastAsia="Arial" w:hAnsi="Arial"/>
-          <w:b/>
-          <w:bCs/>
-          <w:color w:val="26215C"/>
-          <w:sz w:val="28"/>
-          <w:szCs w:val="28"/>
-        </w:rPr>
-        <w:t xml:space="preserve">1.  EXISTING INFRASTRUCTURE — Gas Pipeline Asymmetry</w:t>
-      </w:r>
-    </w:p>
-    <w:p>
-      <w:pPr>
-        <w:spacing w:after="100"/>
-        <w:ind w:left="360"/>
-      </w:pPr>
-      <w:r>
-        <w:rPr>
-          <w:rFonts w:ascii="Arial" w:cs="Arial" w:eastAsia="Arial" w:hAnsi="Arial"/>
-          <w:sz w:val="28"/>
-          <w:szCs w:val="28"/>
-        </w:rPr>
-        <w:t xml:space="preserve">•  March 19 working session — city deprioritized Rockwood for </w:t>
-      </w:r>
-      <w:r>
-        <w:rPr>
-          <w:rFonts w:ascii="Arial" w:cs="Arial" w:eastAsia="Arial" w:hAnsi="Arial"/>
-          <w:b/>
-          <w:bCs/>
-          <w:sz w:val="28"/>
-          <w:szCs w:val="28"/>
-        </w:rPr>
-        <w:t xml:space="preserve">Columbia Gulf gas pipeline easement</w:t>
-      </w:r>
-    </w:p>
-    <w:p>
-      <w:pPr>
-        <w:spacing w:after="100"/>
-        <w:ind w:left="360"/>
-      </w:pPr>
-      <w:r>
-        <w:rPr>
-          <w:rFonts w:ascii="Arial" w:cs="Arial" w:eastAsia="Arial" w:hAnsi="Arial"/>
-          <w:sz w:val="28"/>
-          <w:szCs w:val="28"/>
-        </w:rPr>
-        <w:t xml:space="preserve">•  SAME pipeline crosses Mann Road · Berea Church · Maple Hill · Coles Ferry Pike</w:t>
-      </w:r>
-    </w:p>
-    <w:p>
-      <w:pPr>
-        <w:spacing w:after="100"/>
-        <w:ind w:left="360"/>
-      </w:pPr>
-      <w:r>
-        <w:rPr>
-          <w:rFonts w:ascii="Arial" w:cs="Arial" w:eastAsia="Arial" w:hAnsi="Arial"/>
-          <w:sz w:val="28"/>
-          <w:szCs w:val="28"/>
-        </w:rPr>
-        <w:t xml:space="preserve">•  3 lines:  Mainline 100/200/300  ·  30–36 inch  ·  </w:t>
-      </w:r>
-      <w:r>
-        <w:rPr>
-          <w:rFonts w:ascii="Arial" w:cs="Arial" w:eastAsia="Arial" w:hAnsi="Arial"/>
-          <w:b/>
-          <w:bCs/>
-          <w:sz w:val="28"/>
-          <w:szCs w:val="28"/>
-        </w:rPr>
-        <w:t xml:space="preserve">935–1,007 psig</w:t>
-      </w:r>
-    </w:p>
-    <w:p>
-      <w:pPr>
-        <w:spacing w:after="100"/>
-        <w:ind w:left="360"/>
-      </w:pPr>
-      <w:r>
-        <w:rPr>
-          <w:rFonts w:ascii="Arial" w:cs="Arial" w:eastAsia="Arial" w:hAnsi="Arial"/>
-          <w:sz w:val="28"/>
-          <w:szCs w:val="28"/>
-        </w:rPr>
-        <w:t xml:space="preserve">•  Line 200 ruptured in KY — 2012 (86-ft crater) &amp; 2014 (</w:t>
-      </w:r>
-      <w:r>
-        <w:rPr>
-          <w:rFonts w:ascii="Arial" w:cs="Arial" w:eastAsia="Arial" w:hAnsi="Arial"/>
-          <w:b/>
-          <w:bCs/>
-          <w:sz w:val="28"/>
-          <w:szCs w:val="28"/>
-        </w:rPr>
-        <w:t xml:space="preserve">105-ft crater, 2 injured, 2 homes destroyed</w:t>
-      </w:r>
-      <w:r>
-        <w:rPr>
-          <w:rFonts w:ascii="Arial" w:cs="Arial" w:eastAsia="Arial" w:hAnsi="Arial"/>
-          <w:sz w:val="28"/>
-          <w:szCs w:val="28"/>
-        </w:rPr>
-        <w:t xml:space="preserve">)</w:t>
-      </w:r>
-    </w:p>
-    <w:p>
-      <w:pPr>
-        <w:spacing w:after="100"/>
-        <w:ind w:left="360"/>
-      </w:pPr>
-      <w:r>
-        <w:rPr>
-          <w:rFonts w:ascii="Arial" w:cs="Arial" w:eastAsia="Arial" w:hAnsi="Arial"/>
-          <w:sz w:val="28"/>
-          <w:szCs w:val="28"/>
-        </w:rPr>
-        <w:t xml:space="preserve">•  PHMSA cause:  land movement + hydrogen embrittlement — </w:t>
-      </w:r>
-      <w:r>
-        <w:rPr>
-          <w:rFonts w:ascii="Arial" w:cs="Arial" w:eastAsia="Arial" w:hAnsi="Arial"/>
-          <w:b/>
-          <w:bCs/>
-          <w:sz w:val="28"/>
-          <w:szCs w:val="28"/>
-        </w:rPr>
-        <w:t xml:space="preserve">properties of the pipe, not of any one milepost</w:t>
-      </w:r>
-    </w:p>
-    <w:p>
-      <w:pPr>
-        <w:spacing w:after="100"/>
-        <w:ind w:left="360"/>
-      </w:pPr>
-      <w:r>
-        <w:rPr>
-          <w:rFonts w:ascii="Arial" w:cs="Arial" w:eastAsia="Arial" w:hAnsi="Arial"/>
-          <w:sz w:val="28"/>
-          <w:szCs w:val="28"/>
-        </w:rPr>
-        <w:t xml:space="preserve">•  </w:t>
-      </w:r>
-      <w:r>
-        <w:rPr>
-          <w:rFonts w:ascii="Arial" w:cs="Arial" w:eastAsia="Arial" w:hAnsi="Arial"/>
-          <w:b/>
-          <w:bCs/>
-          <w:sz w:val="28"/>
-          <w:szCs w:val="28"/>
-        </w:rPr>
-        <w:t xml:space="preserve">Same standard must apply:</w:t>
-      </w:r>
-      <w:r>
-        <w:rPr>
-          <w:rFonts w:ascii="Arial" w:cs="Arial" w:eastAsia="Arial" w:hAnsi="Arial"/>
-          <w:sz w:val="28"/>
-          <w:szCs w:val="28"/>
-        </w:rPr>
-        <w:t xml:space="preserve">  if Rockwood deprioritized → Sites 1–7 deprioritized</w:t>
-      </w:r>
-    </w:p>
-    <w:p>
-      <w:pPr>
-        <w:spacing w:after="100"/>
-        <w:ind w:left="360"/>
-      </w:pPr>
-      <w:r>
-        <w:rPr>
-          <w:rFonts w:ascii="Arial" w:cs="Arial" w:eastAsia="Arial" w:hAnsi="Arial"/>
-          <w:b/>
-          <w:bCs/>
-          <w:sz w:val="28"/>
-          <w:szCs w:val="28"/>
-        </w:rPr>
-        <w:t xml:space="preserve">•  FORMAL ASK:  produce the Rockwood parcel analysis;  apply same framework to Sites 1–7</w:t>
-      </w:r>
-    </w:p>
-    <w:p>
-      <w:pPr>
-        <w:spacing w:after="240"/>
-        <w:ind w:left="360"/>
-      </w:pPr>
-      <w:r>
-        <w:rPr>
-          <w:rFonts w:ascii="Arial" w:cs="Arial" w:eastAsia="Arial" w:hAnsi="Arial"/>
-          <w:i/>
-          <w:iCs/>
-          <w:color w:val="5F5E5A"/>
-          <w:sz w:val="26"/>
-          <w:szCs w:val="26"/>
-        </w:rPr>
-        <w:t xml:space="preserve">•  See Appendix H — pipeline corridor, KY rupture history, formal requests</w:t>
-      </w:r>
-    </w:p>
-    <w:p>
-      <w:pPr>
-        <w:spacing w:after="120" w:before="240"/>
-      </w:pPr>
-      <w:r>
-        <w:rPr>
-          <w:rFonts w:ascii="Arial" w:cs="Arial" w:eastAsia="Arial" w:hAnsi="Arial"/>
-          <w:b/>
-          <w:bCs/>
-          <w:color w:val="26215C"/>
-          <w:sz w:val="28"/>
-          <w:szCs w:val="28"/>
-        </w:rPr>
-        <w:t xml:space="preserve">2.  EXISTING INFRASTRUCTURE — F1/F2 Reclassification</w:t>
-      </w:r>
-    </w:p>
-    <w:p>
-      <w:pPr>
-        <w:spacing w:after="100"/>
-        <w:ind w:left="360"/>
-      </w:pPr>
-      <w:r>
-        <w:rPr>
-          <w:rFonts w:ascii="Arial" w:cs="Arial" w:eastAsia="Arial" w:hAnsi="Arial"/>
-          <w:sz w:val="28"/>
-          <w:szCs w:val="28"/>
-        </w:rPr>
-        <w:t xml:space="preserve">•  Cost model dispositive:  $8M "new pipe" per site = over + back at the tangent — </w:t>
-      </w:r>
-      <w:r>
-        <w:rPr>
-          <w:rFonts w:ascii="Arial" w:cs="Arial" w:eastAsia="Arial" w:hAnsi="Arial"/>
-          <w:b/>
-          <w:bCs/>
-          <w:sz w:val="28"/>
-          <w:szCs w:val="28"/>
-        </w:rPr>
-        <w:t xml:space="preserve">no Hartmann-to-site pipe cost appears anywhere</w:t>
-      </w:r>
-    </w:p>
-    <w:p>
-      <w:pPr>
-        <w:spacing w:after="100"/>
-        <w:ind w:left="360"/>
-      </w:pPr>
-      <w:r>
-        <w:rPr>
-          <w:rFonts w:ascii="Arial" w:cs="Arial" w:eastAsia="Arial" w:hAnsi="Arial"/>
-          <w:sz w:val="28"/>
-          <w:szCs w:val="28"/>
-        </w:rPr>
-        <w:t xml:space="preserve">•  Only consistent reading:  existing F1/F2 effluent lines </w:t>
-      </w:r>
-      <w:r>
-        <w:rPr>
-          <w:rFonts w:ascii="Arial" w:cs="Arial" w:eastAsia="Arial" w:hAnsi="Arial"/>
-          <w:b/>
-          <w:bCs/>
-          <w:sz w:val="28"/>
-          <w:szCs w:val="28"/>
-        </w:rPr>
-        <w:t xml:space="preserve">repurposed to carry raw sewage</w:t>
-      </w:r>
-      <w:r>
-        <w:rPr>
-          <w:rFonts w:ascii="Arial" w:cs="Arial" w:eastAsia="Arial" w:hAnsi="Arial"/>
-          <w:sz w:val="28"/>
-          <w:szCs w:val="28"/>
-        </w:rPr>
-        <w:t xml:space="preserve"> upstream of each tangent</w:t>
-      </w:r>
-    </w:p>
-    <w:p>
-      <w:pPr>
-        <w:spacing w:after="100"/>
-        <w:ind w:left="360"/>
-      </w:pPr>
-      <w:r>
-        <w:rPr>
-          <w:rFonts w:ascii="Arial" w:cs="Arial" w:eastAsia="Arial" w:hAnsi="Arial"/>
-          <w:sz w:val="28"/>
-          <w:szCs w:val="28"/>
-        </w:rPr>
-        <w:t xml:space="preserve">•  F1/F2 designed for treated water, NOT raw sewage → H2S corrosion, deposition, pressure mismatch, pump-dependent failure</w:t>
-      </w:r>
-    </w:p>
-    <w:p>
-      <w:pPr>
-        <w:spacing w:after="100"/>
-        <w:ind w:left="360"/>
-      </w:pPr>
-      <w:r>
-        <w:rPr>
-          <w:rFonts w:ascii="Arial" w:cs="Arial" w:eastAsia="Arial" w:hAnsi="Arial"/>
-          <w:sz w:val="28"/>
-          <w:szCs w:val="28"/>
-        </w:rPr>
-        <w:t xml:space="preserve">•  Failure shift:  nuisance → </w:t>
-      </w:r>
-      <w:r>
-        <w:rPr>
-          <w:rFonts w:ascii="Arial" w:cs="Arial" w:eastAsia="Arial" w:hAnsi="Arial"/>
-          <w:b/>
-          <w:bCs/>
-          <w:sz w:val="28"/>
-          <w:szCs w:val="28"/>
-        </w:rPr>
-        <w:t xml:space="preserve">pathogenic discharge into karst aquifer</w:t>
-      </w:r>
-      <w:r>
-        <w:rPr>
-          <w:rFonts w:ascii="Arial" w:cs="Arial" w:eastAsia="Arial" w:hAnsi="Arial"/>
-          <w:sz w:val="28"/>
-          <w:szCs w:val="28"/>
-        </w:rPr>
-        <w:t xml:space="preserve">  (38 wells documented, LaGuardo on karst)</w:t>
-      </w:r>
-    </w:p>
-    <w:p>
-      <w:pPr>
-        <w:spacing w:after="100"/>
-        <w:ind w:left="360"/>
-      </w:pPr>
-      <w:r>
-        <w:rPr>
-          <w:rFonts w:ascii="Arial" w:cs="Arial" w:eastAsia="Arial" w:hAnsi="Arial"/>
-          <w:sz w:val="28"/>
-          <w:szCs w:val="28"/>
-        </w:rPr>
-        <w:t xml:space="preserve">•  Pipe age, materials, condition, route: </w:t>
-      </w:r>
-      <w:r>
-        <w:rPr>
-          <w:rFonts w:ascii="Arial" w:cs="Arial" w:eastAsia="Arial" w:hAnsi="Arial"/>
-          <w:b/>
-          <w:bCs/>
-          <w:sz w:val="28"/>
-          <w:szCs w:val="28"/>
-        </w:rPr>
-        <w:t xml:space="preserve">not in public record</w:t>
-      </w:r>
-    </w:p>
-    <w:p>
-      <w:pPr>
-        <w:spacing w:after="100"/>
-        <w:ind w:left="360"/>
-      </w:pPr>
-      <w:r>
-        <w:rPr>
-          <w:rFonts w:ascii="Arial" w:cs="Arial" w:eastAsia="Arial" w:hAnsi="Arial"/>
-          <w:b/>
-          <w:bCs/>
-          <w:sz w:val="28"/>
-          <w:szCs w:val="28"/>
-        </w:rPr>
-        <w:t xml:space="preserve">•  FORMAL ASK:  confirm or refute repurposing on the record;  if yes → engineering certification + TDEC reclassification</w:t>
-      </w:r>
-    </w:p>
-    <w:p>
-      <w:pPr>
-        <w:spacing w:after="240"/>
-        <w:ind w:left="360"/>
-      </w:pPr>
-      <w:r>
-        <w:rPr>
-          <w:rFonts w:ascii="Arial" w:cs="Arial" w:eastAsia="Arial" w:hAnsi="Arial"/>
-          <w:i/>
-          <w:iCs/>
-          <w:color w:val="5F5E5A"/>
-          <w:sz w:val="26"/>
-          <w:szCs w:val="26"/>
-        </w:rPr>
-        <w:t xml:space="preserve">•  See Appendix E — cost-model evidence, risk categories, six formal requests</w:t>
-      </w:r>
-    </w:p>
-    <w:p>
-      <w:pPr>
-        <w:spacing w:after="120" w:before="240"/>
-      </w:pPr>
-      <w:r>
-        <w:rPr>
-          <w:rFonts w:ascii="Arial" w:cs="Arial" w:eastAsia="Arial" w:hAnsi="Arial"/>
-          <w:b/>
-          <w:bCs/>
-          <w:color w:val="26215C"/>
-          <w:sz w:val="28"/>
-          <w:szCs w:val="28"/>
-        </w:rPr>
-        <w:t xml:space="preserve">CLOSE</w:t>
-      </w:r>
-    </w:p>
-    <w:p>
-      <w:pPr>
-        <w:spacing w:after="100"/>
-        <w:ind w:left="360"/>
-      </w:pPr>
-      <w:r>
-        <w:rPr>
-          <w:rFonts w:ascii="Arial" w:cs="Arial" w:eastAsia="Arial" w:hAnsi="Arial"/>
-          <w:b/>
-          <w:bCs/>
-          <w:sz w:val="28"/>
-          <w:szCs w:val="28"/>
-        </w:rPr>
-        <w:t xml:space="preserve">•  Eliminate Sites 1–7 from the final ranking</w:t>
-      </w:r>
-    </w:p>
-    <w:p>
-      <w:pPr>
-        <w:spacing w:after="100"/>
-        <w:ind w:left="360"/>
-      </w:pPr>
-      <w:r>
-        <w:rPr>
-          <w:rFonts w:ascii="Arial" w:cs="Arial" w:eastAsia="Arial" w:hAnsi="Arial"/>
-          <w:sz w:val="28"/>
-          <w:szCs w:val="28"/>
-        </w:rPr>
-        <w:t xml:space="preserve">•  Prioritize Rockwood, Alley-Cassetty, or another site outside the corridor</w:t>
-      </w:r>
-    </w:p>
-    <w:p>
-      <w:pPr>
-        <w:spacing w:after="100"/>
-        <w:ind w:left="360"/>
-      </w:pPr>
-      <w:r>
-        <w:rPr>
-          <w:rFonts w:ascii="Arial" w:cs="Arial" w:eastAsia="Arial" w:hAnsi="Arial"/>
-          <w:sz w:val="28"/>
-          <w:szCs w:val="28"/>
-        </w:rPr>
-        <w:t xml:space="preserve">•  Appendices B–H filed with the clerk;  nearly 200 endorsing residents on the record</w:t>
-      </w:r>
-    </w:p>
-    <w:p>
-      <w:pPr>
-        <w:spacing w:after="240"/>
-        <w:ind w:left="360"/>
-      </w:pPr>
-      <w:r>
-        <w:rPr>
-          <w:rFonts w:ascii="Arial" w:cs="Arial" w:eastAsia="Arial" w:hAnsi="Arial"/>
-          <w:sz w:val="28"/>
-          <w:szCs w:val="28"/>
-        </w:rPr>
-        <w:t xml:space="preserve">•  </w:t>
-      </w:r>
-      <w:r>
-        <w:rPr>
-          <w:rFonts w:ascii="Arial" w:cs="Arial" w:eastAsia="Arial" w:hAnsi="Arial"/>
-          <w:b/>
-          <w:bCs/>
-          <w:i/>
-          <w:iCs/>
-          <w:sz w:val="28"/>
-          <w:szCs w:val="28"/>
-        </w:rPr>
-        <w:t xml:space="preserve">"Please do not solve a municipal problem by destroying residential neighborhoods."</w:t>
-      </w:r>
-    </w:p>
-    <w:p>
-      <w:r>
-        <w:br w:type="page"/>
-      </w:r>
-    </w:p>
-    <w:p>
-      <w:pPr>
-        <w:spacing w:after="120"/>
-        <w:jc w:val="center"/>
-      </w:pPr>
-      <w:r>
-        <w:rPr>
-          <w:rFonts w:ascii="Arial" w:cs="Arial" w:eastAsia="Arial" w:hAnsi="Arial"/>
-          <w:b/>
-          <w:bCs/>
-          <w:sz w:val="36"/>
-          <w:szCs w:val="36"/>
-        </w:rPr>
-        <w:t xml:space="preserve">Read-Aloud Script — 3 Minutes</w:t>
-      </w:r>
-    </w:p>
-    <w:p>
-      <w:pPr>
-        <w:spacing w:after="480"/>
-        <w:jc w:val="center"/>
-      </w:pPr>
-      <w:r>
-        <w:rPr>
-          <w:rFonts w:ascii="Arial" w:cs="Arial" w:eastAsia="Arial" w:hAnsi="Arial"/>
-          <w:i/>
-          <w:iCs/>
-          <w:sz w:val="24"/>
-          <w:szCs w:val="24"/>
-        </w:rPr>
-        <w:t xml:space="preserve">Verbatim text for podium delivery; aligned with the keyword outline above.</w:t>
-      </w:r>
-    </w:p>
-    <w:p>
-      <w:pPr>
-        <w:spacing w:after="120" w:before="240"/>
-      </w:pPr>
-      <w:r>
-        <w:rPr>
-          <w:rFonts w:ascii="Arial" w:cs="Arial" w:eastAsia="Arial" w:hAnsi="Arial"/>
-          <w:b/>
-          <w:bCs/>
-          <w:color w:val="26215C"/>
-          <w:sz w:val="24"/>
-          <w:szCs w:val="24"/>
-        </w:rPr>
-        <w:t xml:space="preserve">OPENING</w:t>
-      </w:r>
-    </w:p>
-    <w:p>
-      <w:pPr>
-        <w:spacing w:after="360" w:line="480"/>
-      </w:pPr>
-      <w:r>
-        <w:rPr>
-          <w:rFonts w:ascii="Arial" w:cs="Arial" w:eastAsia="Arial" w:hAnsi="Arial"/>
-          <w:sz w:val="28"/>
-          <w:szCs w:val="28"/>
-        </w:rPr>
-        <w:t xml:space="preserve">Chairman Baines, members of the committee — my name is Todd Roark, speaking again for myself, Tich Chaikumnerd, and nearly two hundred endorsing residents. I spoke on May 27 and June 2; today I have two new arguments and a formal request on each, documented in Appendices B through H.</w:t>
-      </w:r>
-    </w:p>
-    <w:p>
-      <w:pPr>
-        <w:spacing w:after="120" w:before="240"/>
-      </w:pPr>
-      <w:r>
-        <w:rPr>
-          <w:rFonts w:ascii="Arial" w:cs="Arial" w:eastAsia="Arial" w:hAnsi="Arial"/>
-          <w:b/>
-          <w:bCs/>
-          <w:color w:val="26215C"/>
-          <w:sz w:val="24"/>
-          <w:szCs w:val="24"/>
-        </w:rPr>
-        <w:t xml:space="preserve">1.  EXISTING INFRASTRUCTURE — Gas Pipeline Asymmetry</w:t>
-      </w:r>
-    </w:p>
-    <w:p>
-      <w:pPr>
-        <w:spacing w:after="240" w:line="480"/>
-      </w:pPr>
-      <w:r>
-        <w:rPr>
-          <w:rFonts w:ascii="Arial" w:cs="Arial" w:eastAsia="Arial" w:hAnsi="Arial"/>
-          <w:sz w:val="28"/>
-          <w:szCs w:val="28"/>
-        </w:rPr>
-        <w:t xml:space="preserve">First, Existing Infrastructure. At the city's March 19 working session, the Rockwood site was reportedly deprioritized because of a Columbia Gulf Transmission gas pipeline easement. That same pipeline crosses Mann Road, Berea Church Road, Maple Hill, and Coles Ferry Pike — affecting all seven corridor sites.</w:t>
-      </w:r>
-    </w:p>
-    <w:p>
-      <w:pPr>
-        <w:spacing w:after="240" w:line="480"/>
-      </w:pPr>
-      <w:r>
-        <w:rPr>
-          <w:rFonts w:ascii="Arial" w:cs="Arial" w:eastAsia="Arial" w:hAnsi="Arial"/>
-          <w:sz w:val="28"/>
-          <w:szCs w:val="28"/>
-        </w:rPr>
-        <w:t xml:space="preserve">The same Columbia Gulf Line 200 ruptured in Kentucky in 2012, and again in 2014. The 2014 rupture left a one-hundred-and-five-foot crater, destroyed two homes, and injured two people. PHMSA attributed the cause to land movement and hydrogen embrittlement — properties of the pipe itself, not unique to any one milepost.</w:t>
-      </w:r>
-    </w:p>
-    <w:p>
-      <w:pPr>
-        <w:spacing w:after="360" w:line="480"/>
-      </w:pPr>
-      <w:r>
-        <w:rPr>
-          <w:rFonts w:ascii="Arial" w:cs="Arial" w:eastAsia="Arial" w:hAnsi="Arial"/>
-          <w:sz w:val="28"/>
-          <w:szCs w:val="28"/>
-        </w:rPr>
-        <w:t xml:space="preserve">If this pipeline deprioritizes Rockwood, it must deprioritize Sites 1 through 7 by the same standard. </w:t>
-      </w:r>
-      <w:r>
-        <w:rPr>
-          <w:rFonts w:ascii="Arial" w:cs="Arial" w:eastAsia="Arial" w:hAnsi="Arial"/>
-          <w:b/>
-          <w:bCs/>
-          <w:sz w:val="28"/>
-          <w:szCs w:val="28"/>
-        </w:rPr>
-        <w:t xml:space="preserve">I formally request the committee produce the Rockwood parcel risk analysis, and apply that same framework to each of the corridor sites.</w:t>
-      </w:r>
-      <w:r>
-        <w:rPr>
-          <w:rFonts w:ascii="Arial" w:cs="Arial" w:eastAsia="Arial" w:hAnsi="Arial"/>
-          <w:sz w:val="28"/>
-          <w:szCs w:val="28"/>
-        </w:rPr>
-        <w:t xml:space="preserve"> Appendix H has the details.</w:t>
-      </w:r>
-    </w:p>
-    <w:p>
-      <w:pPr>
-        <w:spacing w:after="120" w:before="240"/>
-      </w:pPr>
-      <w:r>
-        <w:rPr>
-          <w:rFonts w:ascii="Arial" w:cs="Arial" w:eastAsia="Arial" w:hAnsi="Arial"/>
-          <w:b/>
-          <w:bCs/>
-          <w:color w:val="26215C"/>
-          <w:sz w:val="24"/>
-          <w:szCs w:val="24"/>
-        </w:rPr>
-        <w:t xml:space="preserve">2.  EXISTING INFRASTRUCTURE — F1/F2 Reclassification</w:t>
-      </w:r>
-    </w:p>
-    <w:p>
-      <w:pPr>
-        <w:spacing w:after="240" w:line="480"/>
-      </w:pPr>
-      <w:r>
-        <w:rPr>
-          <w:rFonts w:ascii="Arial" w:cs="Arial" w:eastAsia="Arial" w:hAnsi="Arial"/>
-          <w:sz w:val="28"/>
-          <w:szCs w:val="28"/>
-        </w:rPr>
-        <w:t xml:space="preserve">Second, still on Existing Infrastructure. The engineer's cost model assigns roughly eight million dollars in new pipe to each candidate site — an over-and-back connection at the tangent to the existing force main corridor. What it does </w:t>
-      </w:r>
-      <w:r>
-        <w:rPr>
-          <w:rFonts w:ascii="Arial" w:cs="Arial" w:eastAsia="Arial" w:hAnsi="Arial"/>
-          <w:i/>
-          <w:iCs/>
-          <w:sz w:val="28"/>
-          <w:szCs w:val="28"/>
-        </w:rPr>
-        <w:t xml:space="preserve">not</w:t>
-      </w:r>
-      <w:r>
-        <w:rPr>
-          <w:rFonts w:ascii="Arial" w:cs="Arial" w:eastAsia="Arial" w:hAnsi="Arial"/>
-          <w:sz w:val="28"/>
-          <w:szCs w:val="28"/>
-        </w:rPr>
-        <w:t xml:space="preserve"> include is any pipe from the existing Hartmann plant to the new plant site.</w:t>
-      </w:r>
-    </w:p>
-    <w:p>
-      <w:pPr>
-        <w:spacing w:after="240" w:line="480"/>
-      </w:pPr>
-      <w:r>
-        <w:rPr>
-          <w:rFonts w:ascii="Arial" w:cs="Arial" w:eastAsia="Arial" w:hAnsi="Arial"/>
-          <w:sz w:val="28"/>
-          <w:szCs w:val="28"/>
-        </w:rPr>
-        <w:t xml:space="preserve">The only configuration consistent with that cost model is one in which the existing thirty-inch effluent lines, F1 and F2, are repurposed to carry raw sewage upstream of each site's tangent. Those lines were specified for treated water, not raw sewage. The failure consequence shifts from environmental nuisance to pathogenic discharge into the karst aquifer documented in Appendix C.</w:t>
-      </w:r>
-    </w:p>
-    <w:p>
-      <w:pPr>
-        <w:spacing w:after="360" w:line="480"/>
-      </w:pPr>
-      <w:r>
-        <w:rPr>
-          <w:rFonts w:ascii="Arial" w:cs="Arial" w:eastAsia="Arial" w:hAnsi="Arial"/>
-          <w:b/>
-          <w:bCs/>
-          <w:sz w:val="28"/>
-          <w:szCs w:val="28"/>
-        </w:rPr>
-        <w:t xml:space="preserve">I formally request the committee confirm or refute the repurposing on the record. If confirmed, require engineering certification and TDEC reclassification before any site advances.</w:t>
-      </w:r>
-      <w:r>
-        <w:rPr>
-          <w:rFonts w:ascii="Arial" w:cs="Arial" w:eastAsia="Arial" w:hAnsi="Arial"/>
-          <w:sz w:val="28"/>
-          <w:szCs w:val="28"/>
-        </w:rPr>
-        <w:t xml:space="preserve"> Appendix E has the cost-model evidence.</w:t>
-      </w:r>
-    </w:p>
-    <w:p>
-      <w:pPr>
-        <w:spacing w:after="120" w:before="240"/>
-      </w:pPr>
-      <w:r>
-        <w:rPr>
-          <w:rFonts w:ascii="Arial" w:cs="Arial" w:eastAsia="Arial" w:hAnsi="Arial"/>
-          <w:b/>
-          <w:bCs/>
-          <w:color w:val="26215C"/>
-          <w:sz w:val="24"/>
-          <w:szCs w:val="24"/>
-        </w:rPr>
-        <w:t xml:space="preserve">CLOSE</w:t>
-      </w:r>
-    </w:p>
-    <w:p>
-      <w:pPr>
-        <w:spacing w:after="240" w:line="480"/>
-      </w:pPr>
-      <w:r>
-        <w:rPr>
-          <w:rFonts w:ascii="Arial" w:cs="Arial" w:eastAsia="Arial" w:hAnsi="Arial"/>
-          <w:sz w:val="28"/>
-          <w:szCs w:val="28"/>
-        </w:rPr>
-        <w:t xml:space="preserve">Our request is unchanged: eliminate Sites 1 through 7 from the final ranking. Prioritize Rockwood, Alley-Cassetty, or one of the additional sites Mayor Hutto referenced. Appendices B through H are filed with the clerk, with nearly two hundred endorsing residents on the record.</w:t>
-      </w:r>
-    </w:p>
-    <w:p>
-      <w:pPr>
-        <w:spacing w:after="240" w:line="480"/>
-      </w:pPr>
-      <w:r>
-        <w:rPr>
-          <w:rFonts w:ascii="Arial" w:cs="Arial" w:eastAsia="Arial" w:hAnsi="Arial"/>
-          <w:b/>
-          <w:bCs/>
-          <w:i/>
-          <w:iCs/>
-          <w:sz w:val="28"/>
-          <w:szCs w:val="28"/>
-        </w:rPr>
-        <w:t xml:space="preserve">Please do not solve a municipal problem by destroying residential neighborhoods. Thank you.</w:t>
-      </w:r>
-    </w:p>
-    <w:p>
-      <w:r>
-        <w:br w:type="page"/>
-      </w:r>
-    </w:p>
     <w:p>
       <w:pPr>
         <w:spacing w:after="360"/>

</xml_diff>

<commit_message>
Add Appendix I (biosolids traffic) and Exhibit D-1 (Mann Road widths) to Rev C
- Appendix D Section 3A: Road Width, with Exhibit D-1 table of field
  measurements (675, 945, 1181, 1323 Mann Rd: 17-18 ft) and note that
  actual widths are ~25-30% narrower than engineer's stated 24 ft
- Appendix I: Biosolids Disposal — Traffic Impact and Infrastructure
  Disclosure Gap; covers current plant gasification, new-site options,
  truck volume estimates at 20 MGD, and road-width/disclosure gap

Co-Authored-By: Claude Sonnet 4.6 <noreply@anthropic.com>
</commit_message>
<xml_diff>
--- a/Public_Record_Statement_Rev_C.docx
+++ b/Public_Record_Statement_Rev_C.docx
@@ -2937,132 +2937,298 @@
           <w:sz w:val="24"/>
           <w:szCs w:val="24"/>
         </w:rPr>
-        <w:t xml:space="preserve">4. Application to the Scoring Matrix</w:t>
-      </w:r>
-    </w:p>
-    <w:p>
-      <w:pPr>
-        <w:spacing w:after="160" w:before="80" w:line="300"/>
-      </w:pPr>
-      <w:r>
-        <w:rPr>
-          <w:rFonts w:ascii="Arial" w:cs="Arial" w:eastAsia="Arial" w:hAnsi="Arial"/>
-          <w:sz w:val="22"/>
-          <w:szCs w:val="22"/>
-        </w:rPr>
-        <w:t xml:space="preserve">Septage operations bear directly on three of the five adopted scoring matrix criteria:</w:t>
-      </w:r>
-    </w:p>
-    <w:p>
-      <w:pPr>
-        <w:pStyle w:val="ListParagraph"/>
-        <w:numPr>
-          <w:ilvl w:val="0"/>
-          <w:numId w:val="2"/>
-        </w:numPr>
-        <w:spacing w:after="120" w:before="60" w:line="300"/>
-      </w:pPr>
-      <w:r>
-        <w:rPr>
-          <w:rFonts w:ascii="Arial" w:cs="Arial" w:eastAsia="Arial" w:hAnsi="Arial"/>
-          <w:b/>
-          <w:bCs/>
-          <w:sz w:val="22"/>
-          <w:szCs w:val="22"/>
-        </w:rPr>
-        <w:t xml:space="preserve">Community Impact (business / property / residential): </w:t>
-      </w:r>
-      <w:r>
-        <w:rPr>
-          <w:rFonts w:ascii="Arial" w:cs="Arial" w:eastAsia="Arial" w:hAnsi="Arial"/>
-          <w:sz w:val="22"/>
-          <w:szCs w:val="22"/>
-        </w:rPr>
-        <w:t xml:space="preserve">Continuous daily truck traffic past residential property frontages, agricultural operations, and a school transit corridor (the school route serving the broader rural area) constitutes a direct, daily-felt community impact. Sites with rural residential frontage on the approach roads (Sites 1 through 7 generally) score materially worse under this criterion than industrial-adjacent sites.</w:t>
-      </w:r>
-    </w:p>
-    <w:p>
-      <w:pPr>
-        <w:pStyle w:val="ListParagraph"/>
-        <w:numPr>
-          <w:ilvl w:val="0"/>
-          <w:numId w:val="2"/>
-        </w:numPr>
-        <w:spacing w:after="120" w:before="60" w:line="300"/>
-      </w:pPr>
-      <w:r>
-        <w:rPr>
-          <w:rFonts w:ascii="Arial" w:cs="Arial" w:eastAsia="Arial" w:hAnsi="Arial"/>
-          <w:b/>
-          <w:bCs/>
-          <w:sz w:val="22"/>
-          <w:szCs w:val="22"/>
-        </w:rPr>
-        <w:t xml:space="preserve">Environmental Impact and Permitting: </w:t>
-      </w:r>
-      <w:r>
-        <w:rPr>
-          <w:rFonts w:ascii="Arial" w:cs="Arial" w:eastAsia="Arial" w:hAnsi="Arial"/>
-          <w:sz w:val="22"/>
-          <w:szCs w:val="22"/>
-        </w:rPr>
-        <w:t xml:space="preserve">A septage receiving station introduces additional permitted point-source emissions (odor, aerosolized pathogens at receiving manifold) and additional regulatory oversight requirements that differ from a non-receiving WWTP.</w:t>
-      </w:r>
-    </w:p>
-    <w:p>
-      <w:pPr>
-        <w:pStyle w:val="ListParagraph"/>
-        <w:numPr>
-          <w:ilvl w:val="0"/>
-          <w:numId w:val="2"/>
-        </w:numPr>
-        <w:spacing w:after="120" w:before="60" w:line="300"/>
-      </w:pPr>
-      <w:r>
-        <w:rPr>
-          <w:rFonts w:ascii="Arial" w:cs="Arial" w:eastAsia="Arial" w:hAnsi="Arial"/>
-          <w:b/>
-          <w:bCs/>
-          <w:sz w:val="22"/>
-          <w:szCs w:val="22"/>
-        </w:rPr>
-        <w:t xml:space="preserve">Existing Infrastructure: </w:t>
-      </w:r>
-      <w:r>
-        <w:rPr>
-          <w:rFonts w:ascii="Arial" w:cs="Arial" w:eastAsia="Arial" w:hAnsi="Arial"/>
-          <w:sz w:val="22"/>
-          <w:szCs w:val="22"/>
-        </w:rPr>
-        <w:t xml:space="preserve">The road sub-base on Mann Road, Berea Church Road, and Coles Ferry Pike was not designed for sustained 60,000-pound multi-axle commercial traffic at the volumes projected in Section 2. Road upgrade costs (widening, sub-base reconstruction, and any required eminent domain along the corridor) are infrastructure costs that should be entered into the site cost analysis but, to the petitioners' knowledge, currently are not.</w:t>
-      </w:r>
-    </w:p>
-    <w:p>
-      <w:pPr>
-        <w:pStyle w:val="ListParagraph"/>
-        <w:numPr>
-          <w:ilvl w:val="0"/>
-          <w:numId w:val="2"/>
-        </w:numPr>
-        <w:spacing w:after="120" w:before="60" w:line="300"/>
-      </w:pPr>
-      <w:r>
-        <w:rPr>
-          <w:rFonts w:ascii="Arial" w:cs="Arial" w:eastAsia="Arial" w:hAnsi="Arial"/>
-          <w:b/>
-          <w:bCs/>
-          <w:sz w:val="22"/>
-          <w:szCs w:val="22"/>
-        </w:rPr>
-        <w:t xml:space="preserve">Service Efficiency: </w:t>
-      </w:r>
-      <w:r>
-        <w:rPr>
-          <w:rFonts w:ascii="Arial" w:cs="Arial" w:eastAsia="Arial" w:hAnsi="Arial"/>
-          <w:sz w:val="22"/>
-          <w:szCs w:val="22"/>
-        </w:rPr>
-        <w:t xml:space="preserve">If the facility is intended to operate as a regional septage hub serving counties beyond Wilson, that is a material expansion of the "service area" beyond the City of Lebanon's incorporated boundary and should be reflected in the criterion as defined.</w:t>
+        <w:t xml:space="preserve">3A. Road Width</w:t>
+      </w:r>
+    </w:p>
+    <w:p>
+      <w:pPr>
+        <w:spacing w:after="160" w:before="80" w:line="300"/>
+      </w:pPr>
+      <w:r>
+        <w:rPr>
+          <w:rFonts w:ascii="Arial" w:cs="Arial" w:eastAsia="Arial" w:hAnsi="Arial"/>
+          <w:sz w:val="22"/>
+          <w:szCs w:val="22"/>
+        </w:rPr>
+        <w:t xml:space="preserve">The vehicle weight analysis in Section 3 addresses load-bearing capacity. A second physical constraint — road width — is independently relevant to whether the approach roads can accommodate the traffic volumes projected in Section 2.</w:t>
+      </w:r>
+    </w:p>
+    <w:p>
+      <w:pPr>
+        <w:spacing w:after="160" w:before="80" w:line="300"/>
+      </w:pPr>
+      <w:r>
+        <w:rPr>
+          <w:rFonts w:ascii="Arial" w:cs="Arial" w:eastAsia="Arial" w:hAnsi="Arial"/>
+          <w:sz w:val="22"/>
+          <w:szCs w:val="22"/>
+        </w:rPr>
+        <w:t xml:space="preserve">At the June 2, 2026 committee meeting, the city engineer characterized Mann Road as "about 24 ft wide" and acknowledged it "was probably not designed for large dump trucks," with roadway improvements anticipated. Field measurements taken on June 4, 2026 document actual widths at four locations along Mann Road that are materially narrower than the engineer's estimate:</w:t>
+      </w:r>
+    </w:p>
+    <w:p>
+      <w:pPr>
+        <w:spacing w:after="80" w:before="160"/>
+      </w:pPr>
+      <w:r>
+        <w:rPr>
+          <w:rFonts w:ascii="Arial" w:cs="Arial" w:eastAsia="Arial" w:hAnsi="Arial"/>
+          <w:b/>
+          <w:bCs/>
+          <w:sz w:val="22"/>
+          <w:szCs w:val="22"/>
+        </w:rPr>
+        <w:t xml:space="preserve">Exhibit D-1: Mann Road Field Measurements (June 4, 2026)</w:t>
+      </w:r>
+    </w:p>
+    <w:tbl>
+      <w:tblPr>
+        <w:tblW w:type="dxa" w:w="9000"/>
+        <w:tblBorders>
+          <w:top w:val="single" w:color="auto" w:sz="4"/>
+          <w:left w:val="single" w:color="auto" w:sz="4"/>
+          <w:bottom w:val="single" w:color="auto" w:sz="4"/>
+          <w:right w:val="single" w:color="auto" w:sz="4"/>
+          <w:insideH w:val="single" w:color="auto" w:sz="4"/>
+          <w:insideV w:val="single" w:color="auto" w:sz="4"/>
+        </w:tblBorders>
+      </w:tblPr>
+      <w:tblGrid>
+        <w:gridCol w:w="5500"/>
+        <w:gridCol w:w="3500"/>
+      </w:tblGrid>
+      <w:tr>
+        <w:tc>
+          <w:tcPr>
+            <w:tcW w:type="dxa" w:w="5500"/>
+          </w:tcPr>
+          <w:p>
+            <w:pPr>
+              <w:jc w:val="left"/>
+            </w:pPr>
+            <w:r>
+              <w:rPr>
+                <w:rFonts w:ascii="Arial" w:cs="Arial" w:eastAsia="Arial" w:hAnsi="Arial"/>
+                <w:b/>
+                <w:bCs/>
+                <w:sz w:val="20"/>
+                <w:szCs w:val="20"/>
+              </w:rPr>
+              <w:t xml:space="preserve">Location</w:t>
+            </w:r>
+          </w:p>
+        </w:tc>
+        <w:tc>
+          <w:tcPr>
+            <w:tcW w:type="dxa" w:w="3500"/>
+          </w:tcPr>
+          <w:p>
+            <w:pPr>
+              <w:jc w:val="left"/>
+            </w:pPr>
+            <w:r>
+              <w:rPr>
+                <w:rFonts w:ascii="Arial" w:cs="Arial" w:eastAsia="Arial" w:hAnsi="Arial"/>
+                <w:b/>
+                <w:bCs/>
+                <w:sz w:val="20"/>
+                <w:szCs w:val="20"/>
+              </w:rPr>
+              <w:t xml:space="preserve">Measured pavement width</w:t>
+            </w:r>
+          </w:p>
+        </w:tc>
+      </w:tr>
+      <w:tr>
+        <w:tc>
+          <w:tcPr>
+            <w:tcW w:type="dxa" w:w="5500"/>
+          </w:tcPr>
+          <w:p>
+            <w:pPr>
+              <w:jc w:val="left"/>
+            </w:pPr>
+            <w:r>
+              <w:rPr>
+                <w:rFonts w:ascii="Arial" w:cs="Arial" w:eastAsia="Arial" w:hAnsi="Arial"/>
+                <w:sz w:val="20"/>
+                <w:szCs w:val="20"/>
+              </w:rPr>
+              <w:t xml:space="preserve">675 Mann Rd</w:t>
+            </w:r>
+          </w:p>
+        </w:tc>
+        <w:tc>
+          <w:tcPr>
+            <w:tcW w:type="dxa" w:w="3500"/>
+          </w:tcPr>
+          <w:p>
+            <w:pPr>
+              <w:jc w:val="left"/>
+            </w:pPr>
+            <w:r>
+              <w:rPr>
+                <w:rFonts w:ascii="Arial" w:cs="Arial" w:eastAsia="Arial" w:hAnsi="Arial"/>
+                <w:sz w:val="20"/>
+                <w:szCs w:val="20"/>
+              </w:rPr>
+              <w:t xml:space="preserve">18 ft</w:t>
+            </w:r>
+          </w:p>
+        </w:tc>
+      </w:tr>
+      <w:tr>
+        <w:tc>
+          <w:tcPr>
+            <w:tcW w:type="dxa" w:w="5500"/>
+          </w:tcPr>
+          <w:p>
+            <w:pPr>
+              <w:jc w:val="left"/>
+            </w:pPr>
+            <w:r>
+              <w:rPr>
+                <w:rFonts w:ascii="Arial" w:cs="Arial" w:eastAsia="Arial" w:hAnsi="Arial"/>
+                <w:sz w:val="20"/>
+                <w:szCs w:val="20"/>
+              </w:rPr>
+              <w:t xml:space="preserve">945 Mann Rd</w:t>
+            </w:r>
+          </w:p>
+        </w:tc>
+        <w:tc>
+          <w:tcPr>
+            <w:tcW w:type="dxa" w:w="3500"/>
+          </w:tcPr>
+          <w:p>
+            <w:pPr>
+              <w:jc w:val="left"/>
+            </w:pPr>
+            <w:r>
+              <w:rPr>
+                <w:rFonts w:ascii="Arial" w:cs="Arial" w:eastAsia="Arial" w:hAnsi="Arial"/>
+                <w:sz w:val="20"/>
+                <w:szCs w:val="20"/>
+              </w:rPr>
+              <w:t xml:space="preserve">17 ft</w:t>
+            </w:r>
+          </w:p>
+        </w:tc>
+      </w:tr>
+      <w:tr>
+        <w:tc>
+          <w:tcPr>
+            <w:tcW w:type="dxa" w:w="5500"/>
+          </w:tcPr>
+          <w:p>
+            <w:pPr>
+              <w:jc w:val="left"/>
+            </w:pPr>
+            <w:r>
+              <w:rPr>
+                <w:rFonts w:ascii="Arial" w:cs="Arial" w:eastAsia="Arial" w:hAnsi="Arial"/>
+                <w:sz w:val="20"/>
+                <w:szCs w:val="20"/>
+              </w:rPr>
+              <w:t xml:space="preserve">1181 Mann Rd</w:t>
+            </w:r>
+          </w:p>
+        </w:tc>
+        <w:tc>
+          <w:tcPr>
+            <w:tcW w:type="dxa" w:w="3500"/>
+          </w:tcPr>
+          <w:p>
+            <w:pPr>
+              <w:jc w:val="left"/>
+            </w:pPr>
+            <w:r>
+              <w:rPr>
+                <w:rFonts w:ascii="Arial" w:cs="Arial" w:eastAsia="Arial" w:hAnsi="Arial"/>
+                <w:sz w:val="20"/>
+                <w:szCs w:val="20"/>
+              </w:rPr>
+              <w:t xml:space="preserve">17 ft</w:t>
+            </w:r>
+          </w:p>
+        </w:tc>
+      </w:tr>
+      <w:tr>
+        <w:tc>
+          <w:tcPr>
+            <w:tcW w:type="dxa" w:w="5500"/>
+          </w:tcPr>
+          <w:p>
+            <w:pPr>
+              <w:jc w:val="left"/>
+            </w:pPr>
+            <w:r>
+              <w:rPr>
+                <w:rFonts w:ascii="Arial" w:cs="Arial" w:eastAsia="Arial" w:hAnsi="Arial"/>
+                <w:sz w:val="20"/>
+                <w:szCs w:val="20"/>
+              </w:rPr>
+              <w:t xml:space="preserve">1323 Mann Rd</w:t>
+            </w:r>
+          </w:p>
+        </w:tc>
+        <w:tc>
+          <w:tcPr>
+            <w:tcW w:type="dxa" w:w="3500"/>
+          </w:tcPr>
+          <w:p>
+            <w:pPr>
+              <w:jc w:val="left"/>
+            </w:pPr>
+            <w:r>
+              <w:rPr>
+                <w:rFonts w:ascii="Arial" w:cs="Arial" w:eastAsia="Arial" w:hAnsi="Arial"/>
+                <w:sz w:val="20"/>
+                <w:szCs w:val="20"/>
+              </w:rPr>
+              <w:t xml:space="preserve">18 ft</w:t>
+            </w:r>
+          </w:p>
+        </w:tc>
+      </w:tr>
+    </w:tbl>
+    <w:p>
+      <w:pPr>
+        <w:spacing w:after="160" w:before="80" w:line="300"/>
+      </w:pPr>
+      <w:r>
+        <w:rPr>
+          <w:rFonts w:ascii="Arial" w:cs="Arial" w:eastAsia="Arial" w:hAnsi="Arial"/>
+          <w:sz w:val="22"/>
+          <w:szCs w:val="22"/>
+        </w:rPr>
+        <w:t xml:space="preserve">These four locations span approximately 0.7 miles of Mann Road. Nothing in the road's topography or construction suggests the measured width is atypical of the corridor as a whole. The measured widths of 17–18 feet are approximately 25–30 percent narrower than the engineer's stated figure.</w:t>
+      </w:r>
+    </w:p>
+    <w:p>
+      <w:pPr>
+        <w:spacing w:after="160" w:before="80" w:line="300"/>
+      </w:pPr>
+      <w:r>
+        <w:rPr>
+          <w:rFonts w:ascii="Arial" w:cs="Arial" w:eastAsia="Arial" w:hAnsi="Arial"/>
+          <w:sz w:val="22"/>
+          <w:szCs w:val="22"/>
+        </w:rPr>
+        <w:t xml:space="preserve">A fully loaded large septage tanker (Section 3) is approximately 8.5 feet wide, exclusive of mirrors. At 17–18 feet of pavement, two such vehicles cannot pass without one pulling aside. At the projected frequency of 40–52 vehicle movements per day under the Wilson County scenario (Section 2), this would occur multiple times per hour during peak periods — a safety condition and a practical conversion of a rural residential road into a commercial haul route.</w:t>
+      </w:r>
+    </w:p>
+    <w:p>
+      <w:pPr>
+        <w:spacing w:after="160" w:before="80" w:line="300"/>
+      </w:pPr>
+      <w:r>
+        <w:rPr>
+          <w:rFonts w:ascii="Arial" w:cs="Arial" w:eastAsia="Arial" w:hAnsi="Arial"/>
+          <w:sz w:val="22"/>
+          <w:szCs w:val="22"/>
+        </w:rPr>
+        <w:t xml:space="preserve">Road widening sufficient to permit safe two-way commercial traffic — to at least 24 feet of actual pavement with adequate shoulders — is an infrastructure cost that should be included in the site cost analysis for Sites 1 through 7. To the petitioners' knowledge, it currently is not.</w:t>
       </w:r>
     </w:p>
     <w:p>
@@ -3077,6 +3243,146 @@
           <w:sz w:val="24"/>
           <w:szCs w:val="24"/>
         </w:rPr>
+        <w:t xml:space="preserve">4. Application to the Scoring Matrix</w:t>
+      </w:r>
+    </w:p>
+    <w:p>
+      <w:pPr>
+        <w:spacing w:after="160" w:before="80" w:line="300"/>
+      </w:pPr>
+      <w:r>
+        <w:rPr>
+          <w:rFonts w:ascii="Arial" w:cs="Arial" w:eastAsia="Arial" w:hAnsi="Arial"/>
+          <w:sz w:val="22"/>
+          <w:szCs w:val="22"/>
+        </w:rPr>
+        <w:t xml:space="preserve">Septage operations bear directly on three of the five adopted scoring matrix criteria:</w:t>
+      </w:r>
+    </w:p>
+    <w:p>
+      <w:pPr>
+        <w:pStyle w:val="ListParagraph"/>
+        <w:numPr>
+          <w:ilvl w:val="0"/>
+          <w:numId w:val="2"/>
+        </w:numPr>
+        <w:spacing w:after="120" w:before="60" w:line="300"/>
+      </w:pPr>
+      <w:r>
+        <w:rPr>
+          <w:rFonts w:ascii="Arial" w:cs="Arial" w:eastAsia="Arial" w:hAnsi="Arial"/>
+          <w:b/>
+          <w:bCs/>
+          <w:sz w:val="22"/>
+          <w:szCs w:val="22"/>
+        </w:rPr>
+        <w:t xml:space="preserve">Community Impact (business / property / residential): </w:t>
+      </w:r>
+      <w:r>
+        <w:rPr>
+          <w:rFonts w:ascii="Arial" w:cs="Arial" w:eastAsia="Arial" w:hAnsi="Arial"/>
+          <w:sz w:val="22"/>
+          <w:szCs w:val="22"/>
+        </w:rPr>
+        <w:t xml:space="preserve">Continuous daily truck traffic past residential property frontages, agricultural operations, and a school transit corridor (the school route serving the broader rural area) constitutes a direct, daily-felt community impact. Sites with rural residential frontage on the approach roads (Sites 1 through 7 generally) score materially worse under this criterion than industrial-adjacent sites.</w:t>
+      </w:r>
+    </w:p>
+    <w:p>
+      <w:pPr>
+        <w:pStyle w:val="ListParagraph"/>
+        <w:numPr>
+          <w:ilvl w:val="0"/>
+          <w:numId w:val="2"/>
+        </w:numPr>
+        <w:spacing w:after="120" w:before="60" w:line="300"/>
+      </w:pPr>
+      <w:r>
+        <w:rPr>
+          <w:rFonts w:ascii="Arial" w:cs="Arial" w:eastAsia="Arial" w:hAnsi="Arial"/>
+          <w:b/>
+          <w:bCs/>
+          <w:sz w:val="22"/>
+          <w:szCs w:val="22"/>
+        </w:rPr>
+        <w:t xml:space="preserve">Environmental Impact and Permitting: </w:t>
+      </w:r>
+      <w:r>
+        <w:rPr>
+          <w:rFonts w:ascii="Arial" w:cs="Arial" w:eastAsia="Arial" w:hAnsi="Arial"/>
+          <w:sz w:val="22"/>
+          <w:szCs w:val="22"/>
+        </w:rPr>
+        <w:t xml:space="preserve">A septage receiving station introduces additional permitted point-source emissions (odor, aerosolized pathogens at receiving manifold) and additional regulatory oversight requirements that differ from a non-receiving WWTP.</w:t>
+      </w:r>
+    </w:p>
+    <w:p>
+      <w:pPr>
+        <w:pStyle w:val="ListParagraph"/>
+        <w:numPr>
+          <w:ilvl w:val="0"/>
+          <w:numId w:val="2"/>
+        </w:numPr>
+        <w:spacing w:after="120" w:before="60" w:line="300"/>
+      </w:pPr>
+      <w:r>
+        <w:rPr>
+          <w:rFonts w:ascii="Arial" w:cs="Arial" w:eastAsia="Arial" w:hAnsi="Arial"/>
+          <w:b/>
+          <w:bCs/>
+          <w:sz w:val="22"/>
+          <w:szCs w:val="22"/>
+        </w:rPr>
+        <w:t xml:space="preserve">Existing Infrastructure: </w:t>
+      </w:r>
+      <w:r>
+        <w:rPr>
+          <w:rFonts w:ascii="Arial" w:cs="Arial" w:eastAsia="Arial" w:hAnsi="Arial"/>
+          <w:sz w:val="22"/>
+          <w:szCs w:val="22"/>
+        </w:rPr>
+        <w:t xml:space="preserve">The road sub-base on Mann Road, Berea Church Road, and Coles Ferry Pike was not designed for sustained 60,000-pound multi-axle commercial traffic at the volumes projected in Section 2. Road upgrade costs (widening, sub-base reconstruction, and any required eminent domain along the corridor) are infrastructure costs that should be entered into the site cost analysis but, to the petitioners' knowledge, currently are not.</w:t>
+      </w:r>
+    </w:p>
+    <w:p>
+      <w:pPr>
+        <w:pStyle w:val="ListParagraph"/>
+        <w:numPr>
+          <w:ilvl w:val="0"/>
+          <w:numId w:val="2"/>
+        </w:numPr>
+        <w:spacing w:after="120" w:before="60" w:line="300"/>
+      </w:pPr>
+      <w:r>
+        <w:rPr>
+          <w:rFonts w:ascii="Arial" w:cs="Arial" w:eastAsia="Arial" w:hAnsi="Arial"/>
+          <w:b/>
+          <w:bCs/>
+          <w:sz w:val="22"/>
+          <w:szCs w:val="22"/>
+        </w:rPr>
+        <w:t xml:space="preserve">Service Efficiency: </w:t>
+      </w:r>
+      <w:r>
+        <w:rPr>
+          <w:rFonts w:ascii="Arial" w:cs="Arial" w:eastAsia="Arial" w:hAnsi="Arial"/>
+          <w:sz w:val="22"/>
+          <w:szCs w:val="22"/>
+        </w:rPr>
+        <w:t xml:space="preserve">If the facility is intended to operate as a regional septage hub serving counties beyond Wilson, that is a material expansion of the "service area" beyond the City of Lebanon's incorporated boundary and should be reflected in the criterion as defined.</w:t>
+      </w:r>
+    </w:p>
+    <w:p>
+      <w:pPr>
+        <w:spacing w:after="120" w:before="240"/>
+      </w:pPr>
+      <w:r>
+        <w:rPr>
+          <w:rFonts w:ascii="Arial" w:cs="Arial" w:eastAsia="Arial" w:hAnsi="Arial"/>
+          <w:b/>
+          <w:bCs/>
+          <w:sz w:val="24"/>
+          <w:szCs w:val="24"/>
+        </w:rPr>
         <w:t xml:space="preserve">5. Formal Requests for Disclosure</w:t>
       </w:r>
     </w:p>
@@ -6238,6 +6544,455 @@
           <w:szCs w:val="22"/>
         </w:rPr>
         <w:t xml:space="preserve">— Todd Roark, Tich Chaikumnerd, and Concerned Residents / Property Owners (Appendix H)</w:t>
+      </w:r>
+    </w:p>
+    <w:p>
+      <w:pPr>
+        <w:spacing w:after="0"/>
+        <w:jc w:val="center"/>
+      </w:pPr>
+      <w:r>
+        <w:rPr>
+          <w:rFonts w:ascii="Arial" w:cs="Arial" w:eastAsia="Arial" w:hAnsi="Arial"/>
+          <w:b/>
+          <w:bCs/>
+          <w:sz w:val="26"/>
+          <w:szCs w:val="26"/>
+        </w:rPr>
+        <w:t xml:space="preserve">SUPPLEMENTAL NOTE — APPENDIX I</w:t>
+      </w:r>
+    </w:p>
+    <w:p>
+      <w:pPr>
+        <w:spacing w:after="360"/>
+        <w:jc w:val="center"/>
+      </w:pPr>
+      <w:r>
+        <w:rPr>
+          <w:rFonts w:ascii="Arial" w:cs="Arial" w:eastAsia="Arial" w:hAnsi="Arial"/>
+          <w:b/>
+          <w:bCs/>
+          <w:sz w:val="24"/>
+          <w:szCs w:val="24"/>
+        </w:rPr>
+        <w:t xml:space="preserve">Biosolids Disposal: Traffic Impact and Infrastructure Disclosure Gap</w:t>
+      </w:r>
+    </w:p>
+    <w:p>
+      <w:pPr>
+        <w:spacing w:after="160" w:before="80" w:line="300"/>
+      </w:pPr>
+      <w:r>
+        <w:rPr>
+          <w:rFonts w:ascii="Arial" w:cs="Arial" w:eastAsia="Arial" w:hAnsi="Arial"/>
+          <w:i/>
+          <w:iCs/>
+          <w:sz w:val="22"/>
+          <w:szCs w:val="22"/>
+        </w:rPr>
+        <w:t xml:space="preserve">Prepared by Todd Roark and Tich Chaikumnerd in support of the Public Record Statement filed with the City of Lebanon Wastewater Treatment Plant Site Selection Committee.</w:t>
+      </w:r>
+    </w:p>
+    <w:p>
+      <w:pPr>
+        <w:spacing w:after="120" w:before="240"/>
+      </w:pPr>
+      <w:r>
+        <w:rPr>
+          <w:rFonts w:ascii="Arial" w:cs="Arial" w:eastAsia="Arial" w:hAnsi="Arial"/>
+          <w:b/>
+          <w:bCs/>
+          <w:sz w:val="24"/>
+          <w:szCs w:val="24"/>
+        </w:rPr>
+        <w:t xml:space="preserve">I.1  Background: Current Plant Biosolids Management</w:t>
+      </w:r>
+    </w:p>
+    <w:p>
+      <w:pPr>
+        <w:spacing w:after="160" w:before="80" w:line="300"/>
+      </w:pPr>
+      <w:r>
+        <w:rPr>
+          <w:rFonts w:ascii="Arial" w:cs="Arial" w:eastAsia="Arial" w:hAnsi="Arial"/>
+          <w:sz w:val="22"/>
+          <w:szCs w:val="22"/>
+        </w:rPr>
+        <w:t xml:space="preserve">The existing Lebanon WWTP at 321 Hartmann Drive operates with a 10 MGD design capacity and includes two features relevant to biosolids management:</w:t>
+      </w:r>
+    </w:p>
+    <w:p>
+      <w:pPr>
+        <w:spacing w:after="160" w:before="80" w:line="300"/>
+      </w:pPr>
+      <w:r>
+        <w:rPr>
+          <w:rFonts w:ascii="Arial" w:cs="Arial" w:eastAsia="Arial" w:hAnsi="Arial"/>
+          <w:b/>
+          <w:bCs/>
+          <w:sz w:val="22"/>
+          <w:szCs w:val="22"/>
+        </w:rPr>
+        <w:t xml:space="preserve">1. High-rate anaerobic digestion </w:t>
+      </w:r>
+      <w:r>
+        <w:rPr>
+          <w:rFonts w:ascii="Arial" w:cs="Arial" w:eastAsia="Arial" w:hAnsi="Arial"/>
+          <w:sz w:val="22"/>
+          <w:szCs w:val="22"/>
+        </w:rPr>
+        <w:t xml:space="preserve">— two 1.9 million-gallon mesophilic digesters with a minimum 30-day retention time, which reduces the volatile solids content of raw sludge by approximately 50–60 percent before dewatering.</w:t>
+      </w:r>
+    </w:p>
+    <w:p>
+      <w:pPr>
+        <w:spacing w:after="160" w:before="80" w:line="300"/>
+      </w:pPr>
+      <w:r>
+        <w:rPr>
+          <w:rFonts w:ascii="Arial" w:cs="Arial" w:eastAsia="Arial" w:hAnsi="Arial"/>
+          <w:b/>
+          <w:bCs/>
+          <w:sz w:val="22"/>
+          <w:szCs w:val="22"/>
+        </w:rPr>
+        <w:t xml:space="preserve">2. On-site gasification </w:t>
+      </w:r>
+      <w:r>
+        <w:rPr>
+          <w:rFonts w:ascii="Arial" w:cs="Arial" w:eastAsia="Arial" w:hAnsi="Arial"/>
+          <w:sz w:val="22"/>
+          <w:szCs w:val="22"/>
+        </w:rPr>
+        <w:t xml:space="preserve">— operational since October 2016, converting dewatered biosolids and wood waste to electricity, substantially reducing or eliminating the volume of biosolids requiring off-site disposal.</w:t>
+      </w:r>
+    </w:p>
+    <w:p>
+      <w:pPr>
+        <w:spacing w:after="160" w:before="80" w:line="300"/>
+      </w:pPr>
+      <w:r>
+        <w:rPr>
+          <w:rFonts w:ascii="Arial" w:cs="Arial" w:eastAsia="Arial" w:hAnsi="Arial"/>
+          <w:sz w:val="22"/>
+          <w:szCs w:val="22"/>
+        </w:rPr>
+        <w:t xml:space="preserve">As a result, outbound heavy-truck traffic attributable to biosolids disposal at the existing Hartmann Drive facility is currently minimal. This is relevant because it means the existing site's traffic profile is not a meaningful baseline for projecting traffic at a new site that would not include equivalent infrastructure.</w:t>
+      </w:r>
+    </w:p>
+    <w:p>
+      <w:pPr>
+        <w:spacing w:after="120" w:before="240"/>
+      </w:pPr>
+      <w:r>
+        <w:rPr>
+          <w:rFonts w:ascii="Arial" w:cs="Arial" w:eastAsia="Arial" w:hAnsi="Arial"/>
+          <w:b/>
+          <w:bCs/>
+          <w:sz w:val="24"/>
+          <w:szCs w:val="24"/>
+        </w:rPr>
+        <w:t xml:space="preserve">I.2  The New Facility Would Not Inherit This Infrastructure</w:t>
+      </w:r>
+    </w:p>
+    <w:p>
+      <w:pPr>
+        <w:spacing w:after="160" w:before="80" w:line="300"/>
+      </w:pPr>
+      <w:r>
+        <w:rPr>
+          <w:rFonts w:ascii="Arial" w:cs="Arial" w:eastAsia="Arial" w:hAnsi="Arial"/>
+          <w:sz w:val="22"/>
+          <w:szCs w:val="22"/>
+        </w:rPr>
+        <w:t xml:space="preserve">The proposed new facility would be built on a greenfield site. The gasification system at the existing plant represents a significant capital investment and a specialized permitting footprint. There is no indication in the public record that the city intends to replicate it at the new location. Without on-site gasification — and potentially without anaerobic digestion, which the city has also not specified — a new 20 MGD facility would generate substantially greater outbound biosolids traffic than the existing plant currently produces.</w:t>
+      </w:r>
+    </w:p>
+    <w:p>
+      <w:pPr>
+        <w:spacing w:after="120" w:before="240"/>
+      </w:pPr>
+      <w:r>
+        <w:rPr>
+          <w:rFonts w:ascii="Arial" w:cs="Arial" w:eastAsia="Arial" w:hAnsi="Arial"/>
+          <w:b/>
+          <w:bCs/>
+          <w:sz w:val="24"/>
+          <w:szCs w:val="24"/>
+        </w:rPr>
+        <w:t xml:space="preserve">I.3  Estimated Biosolids Volume at 20 MGD</w:t>
+      </w:r>
+    </w:p>
+    <w:p>
+      <w:pPr>
+        <w:spacing w:after="160" w:before="80" w:line="300"/>
+      </w:pPr>
+      <w:r>
+        <w:rPr>
+          <w:rFonts w:ascii="Arial" w:cs="Arial" w:eastAsia="Arial" w:hAnsi="Arial"/>
+          <w:sz w:val="22"/>
+          <w:szCs w:val="22"/>
+        </w:rPr>
+        <w:t xml:space="preserve">A conventional municipal treatment plant with biological treatment generates approximately 1,500–2,500 lbs of dry solids per million gallons treated. With anaerobic digestion, net dry solids are reduced by roughly 35 percent:</w:t>
+      </w:r>
+    </w:p>
+    <w:p>
+      <w:pPr>
+        <w:spacing w:after="160" w:before="80" w:line="300"/>
+      </w:pPr>
+      <w:r>
+        <w:rPr>
+          <w:rFonts w:ascii="Arial" w:cs="Arial" w:eastAsia="Arial" w:hAnsi="Arial"/>
+          <w:sz w:val="22"/>
+          <w:szCs w:val="22"/>
+        </w:rPr>
+        <w:t xml:space="preserve">Dry solids at 20 MGD (with digestion): approximately 19,000–32,000 lbs/day</w:t>
+      </w:r>
+    </w:p>
+    <w:p>
+      <w:pPr>
+        <w:spacing w:after="160" w:before="80" w:line="300"/>
+      </w:pPr>
+      <w:r>
+        <w:rPr>
+          <w:rFonts w:ascii="Arial" w:cs="Arial" w:eastAsia="Arial" w:hAnsi="Arial"/>
+          <w:sz w:val="22"/>
+          <w:szCs w:val="22"/>
+        </w:rPr>
+        <w:t xml:space="preserve">Dewatered to approximately 20 percent total solids: approximately 45–80 tons/day</w:t>
+      </w:r>
+    </w:p>
+    <w:p>
+      <w:pPr>
+        <w:spacing w:after="160" w:before="80" w:line="300"/>
+      </w:pPr>
+      <w:r>
+        <w:rPr>
+          <w:rFonts w:ascii="Arial" w:cs="Arial" w:eastAsia="Arial" w:hAnsi="Arial"/>
+          <w:sz w:val="22"/>
+          <w:szCs w:val="22"/>
+        </w:rPr>
+        <w:t xml:space="preserve">At 22 tons per tractor-trailer load: approximately 2–4 truck trips per day on a continuous-haul schedule, or 8–15 trucks on haul days if biosolids are stored and hauled 2–3 times per week.</w:t>
+      </w:r>
+    </w:p>
+    <w:p>
+      <w:pPr>
+        <w:spacing w:after="160" w:before="80" w:line="300"/>
+      </w:pPr>
+      <w:r>
+        <w:rPr>
+          <w:rFonts w:ascii="Arial" w:cs="Arial" w:eastAsia="Arial" w:hAnsi="Arial"/>
+          <w:sz w:val="22"/>
+          <w:szCs w:val="22"/>
+        </w:rPr>
+        <w:t xml:space="preserve">Without anaerobic digestion, these figures increase by approximately 60 percent.</w:t>
+      </w:r>
+    </w:p>
+    <w:p>
+      <w:pPr>
+        <w:spacing w:after="120" w:before="240"/>
+      </w:pPr>
+      <w:r>
+        <w:rPr>
+          <w:rFonts w:ascii="Arial" w:cs="Arial" w:eastAsia="Arial" w:hAnsi="Arial"/>
+          <w:b/>
+          <w:bCs/>
+          <w:sz w:val="24"/>
+          <w:szCs w:val="24"/>
+        </w:rPr>
+        <w:t xml:space="preserve">I.4  Disposal Options and Traffic Consequences</w:t>
+      </w:r>
+    </w:p>
+    <w:p>
+      <w:pPr>
+        <w:spacing w:after="160" w:before="80" w:line="300"/>
+      </w:pPr>
+      <w:r>
+        <w:rPr>
+          <w:rFonts w:ascii="Arial" w:cs="Arial" w:eastAsia="Arial" w:hAnsi="Arial"/>
+          <w:sz w:val="22"/>
+          <w:szCs w:val="22"/>
+        </w:rPr>
+        <w:t xml:space="preserve">The city has not disclosed its intended biosolids management method for the new facility. Three technically feasible options exist, each with traffic consequences:</w:t>
+      </w:r>
+    </w:p>
+    <w:p>
+      <w:pPr>
+        <w:spacing w:after="160" w:before="80" w:line="300"/>
+      </w:pPr>
+      <w:r>
+        <w:rPr>
+          <w:rFonts w:ascii="Arial" w:cs="Arial" w:eastAsia="Arial" w:hAnsi="Arial"/>
+          <w:b/>
+          <w:bCs/>
+          <w:sz w:val="22"/>
+          <w:szCs w:val="22"/>
+        </w:rPr>
+        <w:t xml:space="preserve">Option A — On-site digestion and gasification. </w:t>
+      </w:r>
+      <w:r>
+        <w:rPr>
+          <w:rFonts w:ascii="Arial" w:cs="Arial" w:eastAsia="Arial" w:hAnsi="Arial"/>
+          <w:sz w:val="22"/>
+          <w:szCs w:val="22"/>
+        </w:rPr>
+        <w:t xml:space="preserve">Replicating the existing system would minimize outbound truck traffic but requires capital, permitting, and facility footprint that have not been disclosed and have not been factored into the site size or cost analyses presented to the committee.</w:t>
+      </w:r>
+    </w:p>
+    <w:p>
+      <w:pPr>
+        <w:spacing w:after="160" w:before="80" w:line="300"/>
+      </w:pPr>
+      <w:r>
+        <w:rPr>
+          <w:rFonts w:ascii="Arial" w:cs="Arial" w:eastAsia="Arial" w:hAnsi="Arial"/>
+          <w:b/>
+          <w:bCs/>
+          <w:sz w:val="22"/>
+          <w:szCs w:val="22"/>
+        </w:rPr>
+        <w:t xml:space="preserve">Option B — Haul biosolids to the existing Hartmann Drive plant. </w:t>
+      </w:r>
+      <w:r>
+        <w:rPr>
+          <w:rFonts w:ascii="Arial" w:cs="Arial" w:eastAsia="Arial" w:hAnsi="Arial"/>
+          <w:sz w:val="22"/>
+          <w:szCs w:val="22"/>
+        </w:rPr>
+        <w:t xml:space="preserve">This allows continued use of existing gasification infrastructure but generates permanent round-trip heavy-truck traffic between the new site and 321 Hartmann Drive as an ongoing operational cost of the location choice.</w:t>
+      </w:r>
+    </w:p>
+    <w:p>
+      <w:pPr>
+        <w:spacing w:after="160" w:before="80" w:line="300"/>
+      </w:pPr>
+      <w:r>
+        <w:rPr>
+          <w:rFonts w:ascii="Arial" w:cs="Arial" w:eastAsia="Arial" w:hAnsi="Arial"/>
+          <w:b/>
+          <w:bCs/>
+          <w:sz w:val="22"/>
+          <w:szCs w:val="22"/>
+        </w:rPr>
+        <w:t xml:space="preserve">Option C — Land application or landfill disposal. </w:t>
+      </w:r>
+      <w:r>
+        <w:rPr>
+          <w:rFonts w:ascii="Arial" w:cs="Arial" w:eastAsia="Arial" w:hAnsi="Arial"/>
+          <w:sz w:val="22"/>
+          <w:szCs w:val="22"/>
+        </w:rPr>
+        <w:t xml:space="preserve">Class B biosolids may be land-applied to permitted agricultural sites under 40 CFR Part 503. This requires a permitted disposal site and generates regular heavy-truck movements from the new facility on an indefinite basis.</w:t>
+      </w:r>
+    </w:p>
+    <w:p>
+      <w:pPr>
+        <w:spacing w:after="120" w:before="240"/>
+      </w:pPr>
+      <w:r>
+        <w:rPr>
+          <w:rFonts w:ascii="Arial" w:cs="Arial" w:eastAsia="Arial" w:hAnsi="Arial"/>
+          <w:b/>
+          <w:bCs/>
+          <w:sz w:val="24"/>
+          <w:szCs w:val="24"/>
+        </w:rPr>
+        <w:t xml:space="preserve">I.5  Road-Width Constraint</w:t>
+      </w:r>
+    </w:p>
+    <w:p>
+      <w:pPr>
+        <w:spacing w:after="160" w:before="80" w:line="300"/>
+      </w:pPr>
+      <w:r>
+        <w:rPr>
+          <w:rFonts w:ascii="Arial" w:cs="Arial" w:eastAsia="Arial" w:hAnsi="Arial"/>
+          <w:sz w:val="22"/>
+          <w:szCs w:val="22"/>
+        </w:rPr>
+        <w:t xml:space="preserve">The road-width constraint documented in Appendix D, Exhibit D-1 applies with equal force to outbound biosolids traffic. Field measurements at four locations along Mann Road document actual pavement widths of 17–18 feet. Nothing in the road's topography or construction suggests the measured width is atypical of the corridor as a whole — and the measurements are approximately 25–30 percent narrower than the city engineer's characterization of "about 24 feet" at the June 2 meeting.</w:t>
+      </w:r>
+    </w:p>
+    <w:p>
+      <w:pPr>
+        <w:spacing w:after="160" w:before="80" w:line="300"/>
+      </w:pPr>
+      <w:r>
+        <w:rPr>
+          <w:rFonts w:ascii="Arial" w:cs="Arial" w:eastAsia="Arial" w:hAnsi="Arial"/>
+          <w:sz w:val="22"/>
+          <w:szCs w:val="22"/>
+        </w:rPr>
+        <w:t xml:space="preserve">A loaded biosolids tractor-trailer is approximately 8.5 feet wide. At 17–18 feet of pavement, two such vehicles cannot pass without one pulling aside. At an estimated 2–4 truck trips per day on a continuous-haul schedule, or 8–15 trucks on haul days, this is a permanent operational characteristic of the site — not a construction-phase condition.</w:t>
+      </w:r>
+    </w:p>
+    <w:p>
+      <w:pPr>
+        <w:spacing w:after="160" w:before="80" w:line="300"/>
+      </w:pPr>
+      <w:r>
+        <w:rPr>
+          <w:rFonts w:ascii="Arial" w:cs="Arial" w:eastAsia="Arial" w:hAnsi="Arial"/>
+          <w:sz w:val="22"/>
+          <w:szCs w:val="22"/>
+        </w:rPr>
+        <w:t xml:space="preserve">Combined with the inbound septage traffic documented in Appendix D, the same road carries both inbound tankers and outbound haulers. The two traffic streams are independent in origin but compound on the same physical constraint. Their aggregate impact on the corridor has not been addressed in the public record.</w:t>
+      </w:r>
+    </w:p>
+    <w:p>
+      <w:pPr>
+        <w:spacing w:after="120" w:before="240"/>
+      </w:pPr>
+      <w:r>
+        <w:rPr>
+          <w:rFonts w:ascii="Arial" w:cs="Arial" w:eastAsia="Arial" w:hAnsi="Arial"/>
+          <w:b/>
+          <w:bCs/>
+          <w:sz w:val="24"/>
+          <w:szCs w:val="24"/>
+        </w:rPr>
+        <w:t xml:space="preserve">I.6  Disclosure Request</w:t>
+      </w:r>
+    </w:p>
+    <w:p>
+      <w:pPr>
+        <w:spacing w:after="160" w:before="80" w:line="300"/>
+      </w:pPr>
+      <w:r>
+        <w:rPr>
+          <w:rFonts w:ascii="Arial" w:cs="Arial" w:eastAsia="Arial" w:hAnsi="Arial"/>
+          <w:sz w:val="22"/>
+          <w:szCs w:val="22"/>
+        </w:rPr>
+        <w:t xml:space="preserve">The biosolids management method for the new facility has not been identified in the public record. This is a material omission: the method determines outbound truck volume, which in turn determines road adequacy and the nature of the ongoing impact on the surrounding community. The petitioners request that the city engineer identify, on the public record, the intended biosolids management approach for the new facility before any site is eliminated from consideration.</w:t>
+      </w:r>
+    </w:p>
+    <w:p>
+      <w:pPr>
+        <w:spacing w:after="160" w:before="80" w:line="300"/>
+      </w:pPr>
+      <w:r>
+        <w:rPr>
+          <w:rFonts w:ascii="Arial" w:cs="Arial" w:eastAsia="Arial" w:hAnsi="Arial"/>
+          <w:i/>
+          <w:iCs/>
+          <w:sz w:val="22"/>
+          <w:szCs w:val="22"/>
+        </w:rPr>
+        <w:t xml:space="preserve">Sources: Lebanon Authority Biosolids Treatment Process Description (published); City of Lebanon WWTP documentation; Waste Advantage Magazine, October 2016 (gasification initiative); June 2, 2026 Site Selection Committee meeting transcript; field measurements, June 4, 2026 (Mann Road street widths). Biosolids generation figures are standard engineering ranges per conventional activated sludge design practice; site-specific figures should be confirmed against the plant's current NPDES permit and discharge monitoring reports.</w:t>
+      </w:r>
+    </w:p>
+    <w:p>
+      <w:pPr>
+        <w:spacing w:after="160" w:before="80" w:line="300"/>
+      </w:pPr>
+      <w:r>
+        <w:rPr>
+          <w:rFonts w:ascii="Arial" w:cs="Arial" w:eastAsia="Arial" w:hAnsi="Arial"/>
+          <w:sz w:val="22"/>
+          <w:szCs w:val="22"/>
+        </w:rPr>
+        <w:t xml:space="preserve">— Todd Roark, Tich Chaikumnerd, and Concerned Residents / Property Owners (Appendix I)</w:t>
       </w:r>
     </w:p>
     <w:sectPr>

</xml_diff>

<commit_message>
Add 3-phase power cost analysis to Appendix G of Rev C
Documents unquantified electrical infrastructure cost gap in the
Existing Infrastructure scoring: force main costs are quantified
($1K-$4K/ft) but 3-phase extension costs (~$10-$20/ft + potential
$500K-$2M transformer/substation) are absent for Sites 1, 2, and 8.
Adds formal disclosure request to Section 5.

Co-Authored-By: Claude Sonnet 4.6 <noreply@anthropic.com>
</commit_message>
<xml_diff>
--- a/Public_Record_Statement_Rev_C.docx
+++ b/Public_Record_Statement_Rev_C.docx
@@ -5608,6 +5608,45 @@
     </w:p>
     <w:p>
       <w:pPr>
+        <w:spacing w:after="160" w:before="80" w:line="300"/>
+      </w:pPr>
+      <w:r>
+        <w:rPr>
+          <w:rFonts w:ascii="Arial" w:cs="Arial" w:eastAsia="Arial" w:hAnsi="Arial"/>
+          <w:sz w:val="22"/>
+          <w:szCs w:val="22"/>
+        </w:rPr>
+        <w:t xml:space="preserve">A concrete and measurable instance of this asymmetry is the treatment of electrical infrastructure costs under the Existing Infrastructure criterion. The committee has been provided explicit per-foot cost estimates for force main pipe connections — $1,000/ft for a single connection, rising to $4,000/ft for an over-and-back dual connection — and those figures have been applied site by site throughout the scoring presentations. No equivalent cost estimate has been provided for three-phase electrical service extension, despite the city engineer's acknowledgment at the June 2, 2026 meeting that Sites 1, 2, and 8 lack three-phase service and that extensions would be required for each.</w:t>
+      </w:r>
+    </w:p>
+    <w:p>
+      <w:pPr>
+        <w:spacing w:after="160" w:before="80" w:line="300"/>
+      </w:pPr>
+      <w:r>
+        <w:rPr>
+          <w:rFonts w:ascii="Arial" w:cs="Arial" w:eastAsia="Arial" w:hAnsi="Arial"/>
+          <w:sz w:val="22"/>
+          <w:szCs w:val="22"/>
+        </w:rPr>
+        <w:t xml:space="preserve">Industry benchmarks for rural overhead three-phase distribution extension in comparable utility territories range from approximately $10 to $20 per foot. Over the distances involved for Mann Road sites — where the nearest confirmed three-phase infrastructure is several miles away along Coles Ferry Pike — the line extension alone would cost an estimated $250,000 to $750,000 or more. A 20 MGD wastewater facility's peak electrical demand (on the order of 300–1,000 kW) is a substantial industrial load that may additionally require a dedicated distribution transformer or substation infrastructure upgrade beyond the per-foot extension cost, adding a further estimated $500,000 to $2,000,000 depending on the local grid's capacity. These are not hypothetical future costs; they are infrastructure prerequisites that must be in place before the facility can operate.</w:t>
+      </w:r>
+    </w:p>
+    <w:p>
+      <w:pPr>
+        <w:spacing w:after="160" w:before="80" w:line="300"/>
+      </w:pPr>
+      <w:r>
+        <w:rPr>
+          <w:rFonts w:ascii="Arial" w:cs="Arial" w:eastAsia="Arial" w:hAnsi="Arial"/>
+          <w:sz w:val="22"/>
+          <w:szCs w:val="22"/>
+        </w:rPr>
+        <w:t xml:space="preserve">The resulting asymmetry is direct: force main distance costs are quantified and factored into the committee's infrastructure scoring; electrical infrastructure costs for the same sites are not. A committee member scoring Site 1 against Site 13 on Existing Infrastructure is comparing one site's quantified pipe cost against another site's quantified pipe cost plus an unquantified electrical infrastructure cost that has not appeared in any public presentation. That is not a commensurable comparison.</w:t>
+      </w:r>
+    </w:p>
+    <w:p>
+      <w:pPr>
         <w:pStyle w:val="ListParagraph"/>
         <w:numPr>
           <w:ilvl w:val="0"/>
@@ -5924,6 +5963,24 @@
           <w:szCs w:val="22"/>
         </w:rPr>
         <w:t xml:space="preserve">Defer any elimination vote until the procedural safeguards above have been adopted and made public.</w:t>
+      </w:r>
+    </w:p>
+    <w:p>
+      <w:pPr>
+        <w:pStyle w:val="ListParagraph"/>
+        <w:numPr>
+          <w:ilvl w:val="0"/>
+          <w:numId w:val="2"/>
+        </w:numPr>
+        <w:spacing w:after="120" w:before="60" w:line="300"/>
+      </w:pPr>
+      <w:r>
+        <w:rPr>
+          <w:rFonts w:ascii="Arial" w:cs="Arial" w:eastAsia="Arial" w:hAnsi="Arial"/>
+          <w:sz w:val="22"/>
+          <w:szCs w:val="22"/>
+        </w:rPr>
+        <w:t xml:space="preserve">Require that the city engineer provide, for each site confirmed to lack three-phase electrical service, an estimated cost for the electrical infrastructure extension required to serve a 20 MGD facility — including per-foot line extension, transformer requirements, and any utility infrastructure upgrades — and enter those estimates into the public record before the Existing Infrastructure criterion is scored.</w:t>
       </w:r>
     </w:p>
     <w:p>

</xml_diff>

<commit_message>
Add NPDES Permit TN0028754 citations to Appendix E of Rev C
Three additions to Appendix E:
- Section 3: Cumberland River / Old Hickory Reservoir receiving water
  designation added to the rupture consequence bullet
- Section 4: Two new paragraphs citing permit's "treated municipal
  wastewater" authorization, June 2024 issue date, and biomonitoring
  framework as evidence reclassification requires regulatory action
- Section 5: New disclosure request on whether reclassification was
  disclosed to TDEC at time of 2024 permit application

Co-Authored-By: Claude Sonnet 4.6 <noreply@anthropic.com>
</commit_message>
<xml_diff>
--- a/Public_Record_Statement_Rev_C.docx
+++ b/Public_Record_Statement_Rev_C.docx
@@ -4034,7 +4034,7 @@
           <w:sz w:val="22"/>
           <w:szCs w:val="22"/>
         </w:rPr>
-        <w:t xml:space="preserve">discharges directly into the surface water system.</w:t>
+        <w:t xml:space="preserve">discharges directly into the surface water system. NPDES Permit No. TN0028754 — the City's current discharge permit, issued June 24, 2024 — designates the permitted receiving water as the Cumberland River (Old Hickory Reservoir) at river mile 252.2, a public water supply reservoir. The permit's water quality framework was calculated for treated effluent against Cumberland River dilution flows of 782 MGD (1Q10). A raw sewage discharge into any tributary feeding Old Hickory Reservoir operates entirely outside that framework and introduces pathogens to a public water supply under conditions the permit neither contemplated nor covers.</w:t>
       </w:r>
     </w:p>
     <w:p>
@@ -4190,6 +4190,32 @@
     </w:p>
     <w:p>
       <w:pPr>
+        <w:spacing w:after="160" w:before="80" w:line="300"/>
+      </w:pPr>
+      <w:r>
+        <w:rPr>
+          <w:rFonts w:ascii="Arial" w:cs="Arial" w:eastAsia="Arial" w:hAnsi="Arial"/>
+          <w:sz w:val="22"/>
+          <w:szCs w:val="22"/>
+        </w:rPr>
+        <w:t xml:space="preserve">NPDES Permit No. TN0028754, issued June 24, 2024, effective July 1, 2024, and expiring May 31, 2029, authorizes the City of Lebanon to discharge “treated municipal wastewater from Outfall 001” to the Cumberland River. The authorization is specific: treated municipal wastewater. It does not authorize discharge of raw or partially treated sewage from any point on the F1/F2 alignment. The permit was issued in June 2024 — after the City had begun preliminary planning for the new facility. If the City intended at that time to reclassify F1 and F2 as raw-sewage conveyance lines, that intent should have been disclosed in the permit application. The absence of any such disclosure, and the issuance of a standard treated-effluent permit in 2024, suggests either that the reclassification was not contemplated at the time of permitting or that it was not disclosed to TDEC. Either circumstance confirms that reclassification requires formal regulatory action before it can proceed.</w:t>
+      </w:r>
+    </w:p>
+    <w:p>
+      <w:pPr>
+        <w:spacing w:after="160" w:before="80" w:line="300"/>
+      </w:pPr>
+      <w:r>
+        <w:rPr>
+          <w:rFonts w:ascii="Arial" w:cs="Arial" w:eastAsia="Arial" w:hAnsi="Arial"/>
+          <w:sz w:val="22"/>
+          <w:szCs w:val="22"/>
+        </w:rPr>
+        <w:t xml:space="preserve">The permit also establishes a comprehensive monitoring framework calibrated to treated effluent: water quality-based effluent limits for metals and toxics, and annual biomonitoring requirements using Ceriodaphnia dubia (water fleas) and Pimephales promelas (fathead minnows) tested against “samples of final effluent from Outfall 001” with an LC50 acute toxicity endpoint. This monitoring framework has no applicability to raw sewage and provides no regulatory oversight for the failure modes that reclassification introduces. A rupture of F1 or F2 while carrying raw sewage upstream of the new plant's tangent point would be an unmonitored, unpermitted discharge — outside the scope of every condition in NPDES Permit No. TN0028754.</w:t>
+      </w:r>
+    </w:p>
+    <w:p>
+      <w:pPr>
         <w:spacing w:after="120" w:before="240"/>
       </w:pPr>
       <w:r>
@@ -4322,6 +4348,24 @@
           <w:szCs w:val="22"/>
         </w:rPr>
         <w:t xml:space="preserve">If lining or replacement is contemplated, the cost, schedule, and permitting timeline for that work, separately identified from the per-site "over and back" pipe cost estimates.</w:t>
+      </w:r>
+    </w:p>
+    <w:p>
+      <w:pPr>
+        <w:pStyle w:val="ListParagraph"/>
+        <w:numPr>
+          <w:ilvl w:val="0"/>
+          <w:numId w:val="2"/>
+        </w:numPr>
+        <w:spacing w:after="120" w:before="60" w:line="300"/>
+      </w:pPr>
+      <w:r>
+        <w:rPr>
+          <w:rFonts w:ascii="Arial" w:cs="Arial" w:eastAsia="Arial" w:hAnsi="Arial"/>
+          <w:sz w:val="22"/>
+          <w:szCs w:val="22"/>
+        </w:rPr>
+        <w:t xml:space="preserve">Whether the proposed reclassification of F1 and F2 was disclosed to TDEC at the time of NPDES Permit No. TN0028754's application (permit issued June 24, 2024), and whether TDEC's approval of a standard treated-effluent outfall permit reflects an assumption of continued treated-effluent use of F1 and F2 through the permit's expiration on May 31, 2029.</w:t>
       </w:r>
     </w:p>
     <w:p>

</xml_diff>

<commit_message>
Add Rockwood/MBR example to Appendix F; tech-threshold critique to Appendix G
Appendix F Section 3: concrete Rockwood example showing ~32 acres of
fillable flood fringe could accommodate MBR facility; sixty-acre threshold
undermines otherwise favorable site characteristics.

Appendix G Section 3: third information asymmetry instance — acreage
threshold calibrated to undisclosed CAS technology asymmetrically
disadvantages city-located industrial sites vs. rural residential tracts.

Co-Authored-By: Claude Sonnet 4.6 <noreply@anthropic.com>
</commit_message>
<xml_diff>
--- a/Public_Record_Statement_Rev_C.docx
+++ b/Public_Record_Statement_Rev_C.docx
@@ -4972,6 +4972,19 @@
       <w:r>
         <w:rPr>
           <w:rFonts w:ascii="Arial" w:cs="Arial" w:eastAsia="Arial" w:hAnsi="Arial"/>
+          <w:sz w:val="22"/>
+          <w:szCs w:val="22"/>
+        </w:rPr>
+        <w:t xml:space="preserve">Site 13 (Rockwood) illustrates this concretely. At 99.8 percent in the flood plain, it scores poorly on Size of Property under the current sixty-acre threshold. However, approximately 55 percent of its acreage — roughly thirty-two acres — is flood fringe rather than regulatory floodway. Flood fringe is potentially fillable under FEMA regulations through a Conditional Letter of Map Revision (CLOMR). At the earthwork rate cited by the engineer at the May 27, 2026 meeting ($30 per cubic yard), bringing a portion of that flood fringe to buildable elevation is a quantifiable cost, not a categorical barrier. Thirty-two buildable acres, post-fill, falls within the MBR footprint range identified in Section 2 above for a 20 MGD initial-phase facility. Whether Site 13 is viable is therefore not answerable from the public record as currently constituted — the answer depends on a technology choice that has not been disclosed. The sixty-acre threshold undermines this site’s otherwise favorable characteristics; a technology-informed threshold may not.</w:t>
+      </w:r>
+    </w:p>
+    <w:p>
+      <w:pPr>
+        <w:spacing w:after="160" w:before="80" w:line="300"/>
+      </w:pPr>
+      <w:r>
+        <w:rPr>
+          <w:rFonts w:ascii="Arial" w:cs="Arial" w:eastAsia="Arial" w:hAnsi="Arial"/>
           <w:b/>
           <w:bCs/>
           <w:sz w:val="22"/>
@@ -5687,6 +5700,19 @@
           <w:szCs w:val="22"/>
         </w:rPr>
         <w:t xml:space="preserve">The resulting asymmetry is direct: force main distance costs are quantified and factored into the committee's infrastructure scoring; electrical infrastructure costs for the same sites are not. A committee member scoring Site 1 against Site 13 on Existing Infrastructure is comparing one site's quantified pipe cost against another site's quantified pipe cost plus an unquantified electrical infrastructure cost that has not appeared in any public presentation. That is not a commensurable comparison.</w:t>
+      </w:r>
+    </w:p>
+    <w:p>
+      <w:pPr>
+        <w:spacing w:after="160" w:before="80" w:line="300"/>
+      </w:pPr>
+      <w:r>
+        <w:rPr>
+          <w:rFonts w:ascii="Arial" w:cs="Arial" w:eastAsia="Arial" w:hAnsi="Arial"/>
+          <w:sz w:val="22"/>
+          <w:szCs w:val="22"/>
+        </w:rPr>
+        <w:t xml:space="preserve">A third instance concerns the interaction between treatment technology and flood-plain acreage scoring. The sixty-acre minimum currently penalizing several sites is, as documented in Appendix F, explicitly technology-dependent. Applied without a disclosed technology basis, it functions as an acreage threshold calibrated to the most land-intensive available process — conventional activated sludge — and scores every candidate site against that undisclosed assumption. This asymmetrically disadvantages city-located, industrially-zoned sites, which tend to be smaller and more flood-constrained but may be fully viable under a compact-process design, while it favors large rural tracts that carry significant infrastructure, road, environmental, and community-impact costs of their own. The scoring criterion as currently applied is not neutral: it embeds a technology preference that has not been disclosed, justified, or entered into the public record.</w:t>
       </w:r>
     </w:p>
     <w:p>

</xml_diff>

<commit_message>
Add technology cost comparison to Appendix F; update script
Appendix F: new paragraph before Section 4 documents that MBBR/SBR
cost the same or less than CAS at 20 MGD, and MBR is 6-18% lower
than CAS when nutrient removal is required — strengthening the
technology-threshold asymmetry argument.

Spoken script: one sentence added noting the 60-acre minimum likely
favors the most expensive technology once nutrient removal is factored in.

Co-Authored-By: Claude Sonnet 4.6 <noreply@anthropic.com>
</commit_message>
<xml_diff>
--- a/Public_Record_Statement_Rev_C.docx
+++ b/Public_Record_Statement_Rev_C.docx
@@ -5026,6 +5026,19 @@
     </w:p>
     <w:p>
       <w:pPr>
+        <w:spacing w:after="160" w:before="80" w:line="300"/>
+      </w:pPr>
+      <w:r>
+        <w:rPr>
+          <w:rFonts w:ascii="Arial" w:cs="Arial" w:eastAsia="Arial" w:hAnsi="Arial"/>
+          <w:sz w:val="22"/>
+          <w:szCs w:val="22"/>
+        </w:rPr>
+        <w:t xml:space="preserve">The cost relationship reinforces this point. Published comparative analysis of 20 MGD municipal facilities shows that technologies requiring significantly less land carry capital costs at or below that of conventional activated sludge: MBBR and SBR are cost-comparable to CAS, while MBR — though typically carrying a 30–50 percent capital premium — has been found to be 6–18 percent lower in capital cost than CAS when nutrient removal is required. A 20 MGD facility discharging to Old Hickory Reservoir will almost certainly face nutrient limits under its NPDES permit. The sixty-acre minimum therefore not only disadvantages city-located sites; it does so while potentially favoring a more expensive technology on a compliance-cost basis.</w:t>
+      </w:r>
+    </w:p>
+    <w:p>
+      <w:pPr>
         <w:spacing w:after="120" w:before="240"/>
       </w:pPr>
       <w:r>

</xml_diff>

<commit_message>
Add narrative summaries for Appendices E-I to Rev C leading section
Five new paragraphs added before the closing Our request paragraph,
covering force main reclassification (E), technology/acreage threshold (F),
shortlisting safeguards (G), Columbia Gulf pipeline asymmetry (H), and
biosolids disposal (I). Title heading and closing appendix list updated to
include Appendix I.

Co-Authored-By: Claude Sonnet 4.6 <noreply@anthropic.com>
</commit_message>
<xml_diff>
--- a/Public_Record_Statement_Rev_C.docx
+++ b/Public_Record_Statement_Rev_C.docx
@@ -15,7 +15,7 @@
           <w:sz w:val="32"/>
           <w:szCs w:val="32"/>
         </w:rPr>
-        <w:t xml:space="preserve">SUMMARIZATION OF NEW APPENDICES (B, C, D, E, F, G, H)</w:t>
+        <w:t xml:space="preserve">SUMMARIZATION OF NEW APPENDICES (B, C, D, E, F, G, H, I)</w:t>
       </w:r>
     </w:p>
     <w:p>
@@ -403,10 +403,125 @@
       <w:r>
         <w:rPr>
           <w:rFonts w:ascii="Arial" w:cs="Arial" w:eastAsia="Arial" w:hAnsi="Arial"/>
+          <w:b/>
+          <w:bCs/>
           <w:sz w:val="28"/>
           <w:szCs w:val="28"/>
         </w:rPr>
-        <w:t xml:space="preserve">Our request: eliminate Sites 1 through 7 from the final ranking matrix. Prioritize the Rockwood and Alley-Cassetty footprints, or one of the additional sites Mayor Hutto referenced last week. Appendices B, C, D, E, F, G, and H are filed with the clerk and incorporate the citations, the well-count map, the truck-volume calculations, the F1/F2 reclassification analysis, the technology-and-footprint disclosure request, the recommended shortlisting safeguards, and the Columbia Gulf gas pipeline asymmetry analysis.</w:t>
+        <w:t xml:space="preserve">Fourth, Existing Infrastructure — force main reclassification. </w:t>
+      </w:r>
+      <w:r>
+        <w:rPr>
+          <w:rFonts w:ascii="Arial" w:cs="Arial" w:eastAsia="Arial" w:hAnsi="Arial"/>
+          <w:sz w:val="28"/>
+          <w:szCs w:val="28"/>
+        </w:rPr>
+        <w:t xml:space="preserve">The engineer's per-site cost model is built entirely on connection distances to the existing thirty-inch effluent force mains, F1 and F2. The only configuration consistent with that model is one in which F1 and F2 are repurposed upstream of the new plant to carry raw sewage — a function these pipes were not permitted to perform. NPDES permit TN0028754, issued by TDEC in June 2025, authorizes F1 and F2 to discharge treated municipal wastewater to Old Hickory Reservoir. Repurposing them to carry raw sewage upstream is a regulatory reclassification that has not been initiated with TDEC on the public record. The existing pipe material has not been disclosed. The condition has not been documented. Whether the pipes can sustain raw sewage pressure — including the consequences of a pump failure above the karst aquifer that serves thirty-eight private wells and the LaGuardo Utility District — has not been analyzed. Appendix E documents the regulatory framework, the NPDES permit citations, and the formal disclosure requests.</w:t>
+      </w:r>
+    </w:p>
+    <w:p>
+      <w:pPr>
+        <w:spacing w:after="240" w:before="120" w:line="360"/>
+      </w:pPr>
+      <w:r>
+        <w:rPr>
+          <w:rFonts w:ascii="Arial" w:cs="Arial" w:eastAsia="Arial" w:hAnsi="Arial"/>
+          <w:b/>
+          <w:bCs/>
+          <w:sz w:val="28"/>
+          <w:szCs w:val="28"/>
+        </w:rPr>
+        <w:t xml:space="preserve">Fifth, Existing Infrastructure — treatment technology and acreage threshold. </w:t>
+      </w:r>
+      <w:r>
+        <w:rPr>
+          <w:rFonts w:ascii="Arial" w:cs="Arial" w:eastAsia="Arial" w:hAnsi="Arial"/>
+          <w:sz w:val="28"/>
+          <w:szCs w:val="28"/>
+        </w:rPr>
+        <w:t xml:space="preserve">The committee's sixty-acre minimum is calibrated to conventional activated sludge, the most land-intensive process in municipal use. Alternative technologies at the twenty-MGD scale require significantly less land — membrane bioreactors occupy forty to sixty percent of the footprint of CAS — and carry comparable or lower capital costs. At twenty MGD, MBBR and SBR cost the same as or less than CAS; MBR has been found to be six to eighteen percent lower in capital cost than CAS when nutrient removal is required, a condition Old Hickory Reservoir's water quality standards will almost certainly impose. The sixty-acre threshold therefore not only eliminates otherwise-viable city-located industrial sites; it may do so in favor of a more expensive technology. The treatment technology has not been disclosed. Appendix F documents the footprint data, the cost comparison, and the formal disclosure request.</w:t>
+      </w:r>
+    </w:p>
+    <w:p>
+      <w:pPr>
+        <w:spacing w:after="240" w:before="120" w:line="360"/>
+      </w:pPr>
+      <w:r>
+        <w:rPr>
+          <w:rFonts w:ascii="Arial" w:cs="Arial" w:eastAsia="Arial" w:hAnsi="Arial"/>
+          <w:b/>
+          <w:bCs/>
+          <w:sz w:val="28"/>
+          <w:szCs w:val="28"/>
+        </w:rPr>
+        <w:t xml:space="preserve">Sixth, Shortlisting methodology — procedural safeguards. </w:t>
+      </w:r>
+      <w:r>
+        <w:rPr>
+          <w:rFonts w:ascii="Arial" w:cs="Arial" w:eastAsia="Arial" w:hAnsi="Arial"/>
+          <w:sz w:val="28"/>
+          <w:szCs w:val="28"/>
+        </w:rPr>
+        <w:t xml:space="preserve">The committee has stated, on the record, that the scoring matrix is preliminary and that harder questions come later. The petitioners do not object to shortlisting. They do object to the absence of documented safeguards that make the matrix's outputs reproducible and defensible: anchored scoring levels for each criterion, comparable engineering-data depth across all sites, a documented basis for the importance-factor weights, a sensitivity analysis showing that single-step score changes do not alter which sites are eliminated, and a reservation of authority to revive eliminated sites if shortlisted candidates prove unworkable in deeper review. Without those safeguards, an elimination made on a framework the committee has already acknowledged is incomplete is effectively permanent. Appendix G documents each required safeguard and includes more than twenty formal disclosure requests tied directly to the committee's five scoring criteria.</w:t>
+      </w:r>
+    </w:p>
+    <w:p>
+      <w:pPr>
+        <w:spacing w:after="240" w:before="120" w:line="360"/>
+      </w:pPr>
+      <w:r>
+        <w:rPr>
+          <w:rFonts w:ascii="Arial" w:cs="Arial" w:eastAsia="Arial" w:hAnsi="Arial"/>
+          <w:b/>
+          <w:bCs/>
+          <w:sz w:val="28"/>
+          <w:szCs w:val="28"/>
+        </w:rPr>
+        <w:t xml:space="preserve">Seventh, Site scoring asymmetry — Columbia Gulf Transmission pipeline. </w:t>
+      </w:r>
+      <w:r>
+        <w:rPr>
+          <w:rFonts w:ascii="Arial" w:cs="Arial" w:eastAsia="Arial" w:hAnsi="Arial"/>
+          <w:sz w:val="28"/>
+          <w:szCs w:val="28"/>
+        </w:rPr>
+        <w:t xml:space="preserve">At the committee's March 19, 2026 working session, the city cited the Columbia Gulf Transmission interstate gas pipeline as a factor that deprioritized the Rockwood site. The same pipeline system — three high-pressure lines, thirty and thirty-six inches in diameter, operating at up to 1,007 psig — crosses the Mann Road, Berea Church Road, Maple Hill Road, and Coles Ferry Pike corridor in which Sites 1 through 7 are located. PHMSA failure investigation reports document two major ruptures of Columbia Gulf Mainline 200 within the past fifteen years, including a 2012 event in Kentucky that expelled pipe fragments and damaged a residence more than 800 feet from the rupture point. The petitioners formally request that the same pipeline risk analysis applied to Rockwood be applied to every candidate site within the Columbia Gulf alignment before any elimination vote. Appendix H documents the pipeline routing, the PHMSA failure record, and the formal request.</w:t>
+      </w:r>
+    </w:p>
+    <w:p>
+      <w:pPr>
+        <w:spacing w:after="240" w:before="120" w:line="360"/>
+      </w:pPr>
+      <w:r>
+        <w:rPr>
+          <w:rFonts w:ascii="Arial" w:cs="Arial" w:eastAsia="Arial" w:hAnsi="Arial"/>
+          <w:b/>
+          <w:bCs/>
+          <w:sz w:val="28"/>
+          <w:szCs w:val="28"/>
+        </w:rPr>
+        <w:t xml:space="preserve">Eighth, Service Efficiency — biosolids disposal. </w:t>
+      </w:r>
+      <w:r>
+        <w:rPr>
+          <w:rFonts w:ascii="Arial" w:cs="Arial" w:eastAsia="Arial" w:hAnsi="Arial"/>
+          <w:sz w:val="28"/>
+          <w:szCs w:val="28"/>
+        </w:rPr>
+        <w:t xml:space="preserve">The existing Hartmann Drive plant converts its biosolids to electricity on-site through a gasification system operational since 2016. A new greenfield facility will not inherit that infrastructure. Without on-site gasification — or anaerobic digestion, which the city has also not specified — a twenty-MGD plant would generate an estimated forty-five to eighty tons of dewatered biosolids per day, requiring two to four daily tractor-trailer loads on a continuous-haul schedule, or eight to fifteen truck trips on haul days if biosolids are stored and batched. Without digestion, those figures increase by approximately sixty percent. The disposal method, the disposal site, and the associated traffic volumes have not been disclosed or factored into any site's scoring. Appendix I documents the current plant's biosolids management infrastructure, the volumetric estimates, and the formal disclosure request.</w:t>
+      </w:r>
+    </w:p>
+    <w:p>
+      <w:pPr>
+        <w:spacing w:after="240" w:before="120" w:line="360"/>
+      </w:pPr>
+      <w:r>
+        <w:rPr>
+          <w:rFonts w:ascii="Arial" w:cs="Arial" w:eastAsia="Arial" w:hAnsi="Arial"/>
+          <w:sz w:val="28"/>
+          <w:szCs w:val="28"/>
+        </w:rPr>
+        <w:t xml:space="preserve">Our request: eliminate Sites 1 through 7 from the final ranking matrix. Prioritize the Rockwood and Alley-Cassetty footprints, or one of the additional sites Mayor Hutto referenced last week. Appendices B, C, D, E, F, G, H, and I are filed with the clerk and incorporate the citations, the well-count map, the truck-volume calculations, the F1/F2 reclassification analysis, the technology-and-footprint disclosure request, the recommended shortlisting safeguards, the Columbia Gulf gas pipeline asymmetry analysis, and the biosolids disposal traffic impact analysis.</w:t>
       </w:r>
     </w:p>
     <w:p>

</xml_diff>

<commit_message>
Add BNR/1962 technology context to Appendix F Section 2
Notes that Lebanon's existing plant (built ~1962) was designed for
BOD removal only, that a new facility will require BNR compliance,
and that compact BNR technologies (MBR, MBBR, AGS) achieve that
compliance in smaller footprints than conventional BNR-CAS.

Co-Authored-By: Claude Sonnet 4.6 <noreply@anthropic.com>
</commit_message>
<xml_diff>
--- a/Public_Record_Statement_Rev_C.docx
+++ b/Public_Record_Statement_Rev_C.docx
@@ -5000,6 +5000,19 @@
     </w:p>
     <w:p>
       <w:pPr>
+        <w:spacing w:after="160" w:before="80" w:line="300"/>
+      </w:pPr>
+      <w:r>
+        <w:rPr>
+          <w:rFonts w:ascii="Arial" w:cs="Arial" w:eastAsia="Arial" w:hAnsi="Arial"/>
+          <w:sz w:val="22"/>
+          <w:szCs w:val="22"/>
+        </w:rPr>
+        <w:t xml:space="preserve">The Lebanon WWTP at Hartmann Drive was constructed in approximately 1962 and designed solely for biochemical oxygen demand (BOD) removal — standard practice at that time. A new facility at 20 MGD will not replicate that design. Discharge to Old Hickory Reservoir will almost certainly require biological nutrient removal (BNR) — the controlled removal of nitrogen and phosphorus — which was not part of original CAS design practice and has been required by regulators with increasing frequency since the 1970s. Conventional BNR-CAS requires somewhat larger reactor volumes than BOD-only CAS, and this is likely the basis for the 60-acre threshold. However, the technologies that achieve BNR in the smallest footprint — MBR, MBBR, and aerobic granular sludge — are also the most current and are in widespread municipal use today. The 60-acre threshold, if calibrated to BNR-capable CAS, represents the most land-intensive pathway to regulatory compliance. Compact BNR alternatives have not been disclosed or considered in the committee's acreage threshold.</w:t>
+      </w:r>
+    </w:p>
+    <w:p>
+      <w:pPr>
         <w:spacing w:after="120" w:before="240"/>
       </w:pPr>
       <w:r>

</xml_diff>

<commit_message>
Expand Rev C scope to all sites outside city limits; add Anthony Murphy attribution
10 targeted edits: cover page location line, opening paragraph, closing request
paragraph, and applicability notes added to Appendices B, C, D, G, and H.
Also adds attribution to Anthony Murphy (Appendix G What's New bullet and
appendix body) for first raising the shortlisting safeguards concern in the
public record at the June 2, 2026 committee meeting.

Co-Authored-By: Claude Sonnet 4.6 <noreply@anthropic.com>
</commit_message>
<xml_diff>
--- a/Public_Record_Statement_Rev_C.docx
+++ b/Public_Record_Statement_Rev_C.docx
@@ -157,7 +157,7 @@
           <w:sz w:val="24"/>
           <w:szCs w:val="24"/>
         </w:rPr>
-        <w:t xml:space="preserve">Sites 1 through 7 — Mann Road, Berea Church Road, and Coles Ferry Pike corridor, Lebanon, TN</w:t>
+        <w:t xml:space="preserve">All candidate sites outside the city limits of Lebanon, TN — prior formal submissions focused on Sites 1 through 7 (Mann Road, Berea Church Road, and Coles Ferry Pike corridor)</w:t>
       </w:r>
     </w:p>
     <w:p>
@@ -256,6 +256,20 @@
     </w:p>
     <w:p>
       <w:pPr>
+        <w:spacing w:after="80"/>
+        <w:ind w:left="360"/>
+      </w:pPr>
+      <w:r>
+        <w:rPr>
+          <w:rFonts w:ascii="Arial" w:cs="Arial" w:eastAsia="Arial" w:hAnsi="Arial"/>
+          <w:sz w:val="22"/>
+          <w:szCs w:val="22"/>
+        </w:rPr>
+        <w:t xml:space="preserve">•  Shortlisting safeguards (Appendix G) acknowledged to reflect the procedural concern first raised in the public record by Anthony Murphy during the public comment portion of the June 2, 2026 committee meeting.</w:t>
+      </w:r>
+    </w:p>
+    <w:p>
+      <w:pPr>
         <w:spacing w:after="480"/>
         <w:ind w:left="360"/>
       </w:pPr>
@@ -278,7 +292,7 @@
           <w:sz w:val="28"/>
           <w:szCs w:val="28"/>
         </w:rPr>
-        <w:t xml:space="preserve">Seven of the nineteen sites under consideration — Sites 1 through 7 — fall within the same rural residential corridor along Coles Ferry Pike, Mann Road, and Berea Church Road. My comments today address that cluster as a whole, with data drawn from peer-reviewed literature, the TDEC public database, and the public record of the May 27 and June 2, 2026 Site Selection Committee meetings, and mapped directly to your scoring matrix criteria.</w:t>
+        <w:t xml:space="preserve">Seven of the nineteen sites under consideration — Sites 1 through 7 — fall within the same rural residential corridor along Coles Ferry Pike, Mann Road, and Berea Church Road. Additional candidate sites outside the city limits or urban growth boundary — including Sites 8, 18, and others — share the same core concerns: placement of urban infrastructure in rural residential areas, proximity to private wells and agricultural land, and heavy truck traffic on roads not built for it. My comments address Sites 1 through 7 as the primary analytical basis developed in prior submissions; the core arguments extend to any candidate site outside the city limits. Data is drawn from peer-reviewed literature, the TDEC public database, and the public record of the May 27 and June 2, 2026 Site Selection Committee meetings, and is mapped directly to your scoring matrix criteria.</w:t>
       </w:r>
     </w:p>
     <w:p>
@@ -521,7 +535,7 @@
           <w:sz w:val="28"/>
           <w:szCs w:val="28"/>
         </w:rPr>
-        <w:t xml:space="preserve">Our request: eliminate Sites 1 through 7 from the final ranking matrix. Prioritize the Rockwood and Alley-Cassetty footprints, or one of the additional sites Mayor Hutto referenced last week. Appendices B, C, D, E, F, G, H, and I are filed with the clerk and incorporate the citations, the well-count map, the truck-volume calculations, the F1/F2 reclassification analysis, the technology-and-footprint disclosure request, the recommended shortlisting safeguards, the Columbia Gulf gas pipeline asymmetry analysis, and the biosolids disposal traffic impact analysis.</w:t>
+        <w:t xml:space="preserve">Our request: eliminate all candidate sites outside the city limits of Lebanon from the final ranking matrix. The analysis developed for Sites 1 through 7 applies in principle to any rural site outside the urban growth boundary. Prioritize the Rockwood and Alley-Cassetty footprints and the additional city-adjacent sites Mayor Hutto referenced — all have available acreage, existing infrastructure, and none of the rural residential exposure this statement documents. Appendices B, C, D, E, F, G, H, and I are filed with the clerk and incorporate the citations, the well-count map, the truck-volume calculations, the F1/F2 reclassification analysis, the technology-and-footprint disclosure request, the recommended shortlisting safeguards, the Columbia Gulf gas pipeline asymmetry analysis, and the biosolids disposal traffic impact analysis.</w:t>
       </w:r>
     </w:p>
     <w:p>
@@ -1460,6 +1474,19 @@
     </w:p>
     <w:p>
       <w:pPr>
+        <w:spacing w:after="160" w:before="80" w:line="300"/>
+      </w:pPr>
+      <w:r>
+        <w:rPr>
+          <w:rFonts w:ascii="Arial" w:cs="Arial" w:eastAsia="Arial" w:hAnsi="Arial"/>
+          <w:sz w:val="22"/>
+          <w:szCs w:val="22"/>
+        </w:rPr>
+        <w:t xml:space="preserve">Note on applicability: These estimates are developed from the Mann Road and Berea Church Road corridor as the primary subject of this filing. The same distance-decay methodology applies to any candidate site outside the city limits bordered by rural residential properties. Sites 8 and 18, and any other rural sites that remain under consideration, should be scored under the Community Impact criterion using the same Ready (2010) framework applied here.</w:t>
+      </w:r>
+    </w:p>
+    <w:p>
+      <w:pPr>
         <w:spacing w:after="120" w:before="240"/>
       </w:pPr>
       <w:r>
@@ -2053,6 +2080,19 @@
           <w:szCs w:val="22"/>
         </w:rPr>
         <w:t xml:space="preserve">The committee cannot reasonably weigh the risk to residents whose number has not been entered into the public record.</w:t>
+      </w:r>
+    </w:p>
+    <w:p>
+      <w:pPr>
+        <w:spacing w:after="160" w:before="80" w:line="300"/>
+      </w:pPr>
+      <w:r>
+        <w:rPr>
+          <w:rFonts w:ascii="Arial" w:cs="Arial" w:eastAsia="Arial" w:hAnsi="Arial"/>
+          <w:sz w:val="22"/>
+          <w:szCs w:val="22"/>
+        </w:rPr>
+        <w:t xml:space="preserve">Note on applicability: The karst geology and groundwater contamination pathway described in this appendix is not limited to the Mann Road and Berea Church Road corridor. Any candidate site outside the city limits that overlies the same karst formation — including Sites 8, 18, and others in the rural north Lebanon area — is subject to the same contamination risk to private wells and LaGuardo Utility District infrastructure. The committee should conduct a comparable well-count and karst-exposure analysis for any rural site that advances beyond preliminary screening.</w:t>
       </w:r>
     </w:p>
     <w:p>
@@ -3399,7 +3439,7 @@
           <w:sz w:val="22"/>
           <w:szCs w:val="22"/>
         </w:rPr>
-        <w:t xml:space="preserve">Continuous daily truck traffic past residential property frontages, agricultural operations, and a school transit corridor (the school route serving the broader rural area) constitutes a direct, daily-felt community impact. Sites with rural residential frontage on the approach roads (Sites 1 through 7 generally) score materially worse under this criterion than industrial-adjacent sites.</w:t>
+        <w:t xml:space="preserve">Continuous daily truck traffic past residential property frontages, agricultural operations, and a school transit corridor (the school route serving the broader rural area) constitutes a direct, daily-felt community impact. Sites with rural residential frontage on the approach roads — Sites 1 through 7 primarily, but also Sites 8, 18, and any other rural candidate sites outside the city limits — score materially worse under this criterion than industrial-adjacent sites. The road-width and load-bearing analysis in this appendix should be applied to the approach roads of every rural site remaining under consideration, not only the Mann Road corridor.</w:t>
       </w:r>
     </w:p>
     <w:p>
@@ -5508,6 +5548,19 @@
     </w:p>
     <w:p>
       <w:pPr>
+        <w:spacing w:after="160" w:before="80" w:line="300"/>
+      </w:pPr>
+      <w:r>
+        <w:rPr>
+          <w:rFonts w:ascii="Arial" w:cs="Arial" w:eastAsia="Arial" w:hAnsi="Arial"/>
+          <w:sz w:val="22"/>
+          <w:szCs w:val="22"/>
+        </w:rPr>
+        <w:t xml:space="preserve">The concern at the core of this appendix — the absence of anchored scoring rubrics and documented elimination criteria in the committee's matrix — was first raised in the public record by Anthony Murphy during the public comment portion of the June 2, 2026 committee meeting. This appendix develops that concern into the full procedural safeguard framework the petitioners are requesting.</w:t>
+      </w:r>
+    </w:p>
+    <w:p>
+      <w:pPr>
         <w:spacing w:after="120" w:before="240"/>
       </w:pPr>
       <w:r>
@@ -5814,7 +5867,7 @@
           <w:sz w:val="22"/>
           <w:szCs w:val="22"/>
         </w:rPr>
-        <w:t xml:space="preserve">A concrete and measurable instance of this asymmetry is the treatment of electrical infrastructure costs under the Existing Infrastructure criterion. The committee has been provided explicit per-foot cost estimates for force main pipe connections — $1,000/ft for a single connection, rising to $4,000/ft for an over-and-back dual connection — and those figures have been applied site by site throughout the scoring presentations. No equivalent cost estimate has been provided for three-phase electrical service extension, despite the city engineer's acknowledgment at the June 2, 2026 meeting that Sites 1, 2, and 8 lack three-phase service and that extensions would be required for each.</w:t>
+        <w:t xml:space="preserve">A concrete and measurable instance of this asymmetry is the treatment of electrical infrastructure costs under the Existing Infrastructure criterion. The committee has been provided explicit per-foot cost estimates for force main pipe connections — $1,000/ft for a single connection, rising to $4,000/ft for an over-and-back dual connection — and those figures have been applied site by site throughout the scoring presentations. No equivalent cost estimate has been provided for three-phase electrical service extension, despite the city engineer's acknowledgment at the June 2, 2026 meeting that Sites 1, 2, and 8 lack three-phase service and that extensions would be required for each — and potentially other rural sites outside the city limits face the same infrastructure gap.</w:t>
       </w:r>
     </w:p>
     <w:p>
@@ -6606,7 +6659,7 @@
           <w:sz w:val="22"/>
           <w:szCs w:val="22"/>
         </w:rPr>
-        <w:t xml:space="preserve">Sites 1 through 7, located along Mann Road, Berea Church Road, and Coles Ferry Pike, fall within the same Columbia Gulf pipeline corridor invoked to deprioritize Rockwood. </w:t>
+        <w:t xml:space="preserve">Sites 1 through 7, located along Mann Road, Berea Church Road, and Coles Ferry Pike, fall within the same Columbia Gulf pipeline corridor invoked to deprioritize Rockwood. The committee should confirm the Columbia Gulf alignment against every candidate site outside the city limits before any elimination vote — the pipeline corridor is not confined to the Sites 1 through 7 cluster. </w:t>
       </w:r>
       <w:r>
         <w:rPr>

</xml_diff>